<commit_message>
Just some small modifications, nothing to say
</commit_message>
<xml_diff>
--- a/docs/Snake_MAS.docx
+++ b/docs/Snake_MAS.docx
@@ -37,6 +37,8 @@
         </w:rPr>
         <w:t>Snake: Personal Project - Simple Micro-controller</w:t>
       </w:r>
+      <w:bookmarkStart w:id="0" w:name="_GoBack"/>
+      <w:bookmarkEnd w:id="0"/>
     </w:p>
     <w:p>
       <w:pPr>
@@ -635,119 +637,54 @@
     </w:p>
     <w:p>
       <w:pPr>
+        <w:ind w:left="0" w:leftChars="0" w:firstLine="399" w:firstLineChars="142"/>
         <w:jc w:val="left"/>
+        <w:outlineLvl w:val="0"/>
+        <w:rPr>
+          <w:rFonts w:hint="default" w:asciiTheme="majorEastAsia" w:hAnsiTheme="majorEastAsia" w:eastAsiaTheme="majorEastAsia" w:cstheme="majorEastAsia"/>
+          <w:b/>
+          <w:bCs/>
+          <w:color w:val="auto"/>
+          <w:sz w:val="20"/>
+          <w:szCs w:val="20"/>
+        </w:rPr>
+      </w:pPr>
+      <w:r>
         <w:rPr>
           <w:rFonts w:hint="eastAsia" w:asciiTheme="majorEastAsia" w:hAnsiTheme="majorEastAsia" w:eastAsiaTheme="majorEastAsia" w:cstheme="majorEastAsia"/>
           <w:b/>
           <w:bCs/>
+          <w:color w:val="002060"/>
           <w:sz w:val="28"/>
           <w:szCs w:val="28"/>
         </w:rPr>
-      </w:pPr>
-      <w:r>
-        <w:rPr>
-          <w:rFonts w:hint="eastAsia" w:asciiTheme="majorEastAsia" w:hAnsiTheme="majorEastAsia" w:eastAsiaTheme="majorEastAsia" w:cstheme="majorEastAsia"/>
-          <w:b/>
-          <w:bCs/>
-          <w:sz w:val="28"/>
-          <w:szCs w:val="28"/>
-        </w:rPr>
-        <w:t>Preface</w:t>
+        <w:t>Chapter 1: Introduction</w:t>
       </w:r>
     </w:p>
     <w:p>
       <w:pPr>
-        <w:ind w:left="0" w:leftChars="0" w:firstLine="284" w:firstLineChars="142"/>
-        <w:jc w:val="both"/>
-        <w:rPr>
-          <w:rFonts w:hint="eastAsia" w:asciiTheme="majorEastAsia" w:hAnsiTheme="majorEastAsia" w:eastAsiaTheme="majorEastAsia" w:cstheme="majorEastAsia"/>
-          <w:b w:val="0"/>
-          <w:bCs w:val="0"/>
+        <w:ind w:left="0" w:leftChars="0" w:firstLine="400" w:firstLineChars="200"/>
+        <w:jc w:val="left"/>
+        <w:rPr>
+          <w:rFonts w:hint="default" w:asciiTheme="majorEastAsia" w:hAnsiTheme="majorEastAsia" w:eastAsiaTheme="majorEastAsia" w:cstheme="majorEastAsia"/>
+          <w:b/>
+          <w:bCs/>
+          <w:color w:val="auto"/>
           <w:sz w:val="20"/>
           <w:szCs w:val="20"/>
         </w:rPr>
       </w:pPr>
-      <w:r>
-        <w:rPr>
-          <w:rFonts w:hint="eastAsia" w:asciiTheme="majorEastAsia" w:hAnsiTheme="majorEastAsia" w:eastAsiaTheme="majorEastAsia" w:cstheme="majorEastAsia"/>
-          <w:b w:val="0"/>
-          <w:bCs w:val="0"/>
-          <w:sz w:val="20"/>
-          <w:szCs w:val="20"/>
-        </w:rPr>
-        <w:t>This document describes the architecture, operation and the implementation of a simple micro-controller which is built for personal study purpos</w:t>
-      </w:r>
       <w:r>
         <w:rPr>
           <w:rFonts w:hint="default" w:asciiTheme="majorEastAsia" w:hAnsiTheme="majorEastAsia" w:eastAsiaTheme="majorEastAsia" w:cstheme="majorEastAsia"/>
           <w:b w:val="0"/>
           <w:bCs w:val="0"/>
-          <w:sz w:val="20"/>
-          <w:szCs w:val="20"/>
-        </w:rPr>
-        <w:t>e.</w:t>
-      </w:r>
-    </w:p>
-    <w:p>
-      <w:pPr>
-        <w:rPr>
-          <w:rFonts w:hint="eastAsia" w:asciiTheme="majorEastAsia" w:hAnsiTheme="majorEastAsia" w:eastAsiaTheme="majorEastAsia" w:cstheme="majorEastAsia"/>
-          <w:b w:val="0"/>
-          <w:bCs w:val="0"/>
-          <w:sz w:val="20"/>
-          <w:szCs w:val="20"/>
-        </w:rPr>
-      </w:pPr>
-      <w:r>
-        <w:rPr>
-          <w:rFonts w:hint="eastAsia" w:asciiTheme="majorEastAsia" w:hAnsiTheme="majorEastAsia" w:eastAsiaTheme="majorEastAsia" w:cstheme="majorEastAsia"/>
-          <w:b w:val="0"/>
-          <w:bCs w:val="0"/>
-          <w:sz w:val="20"/>
-          <w:szCs w:val="20"/>
-        </w:rPr>
-        <w:br w:type="page"/>
-      </w:r>
-    </w:p>
-    <w:p>
-      <w:pPr>
-        <w:ind w:left="0" w:leftChars="0" w:firstLine="399" w:firstLineChars="142"/>
-        <w:jc w:val="left"/>
-        <w:outlineLvl w:val="0"/>
-        <w:rPr>
-          <w:rFonts w:hint="eastAsia" w:asciiTheme="majorEastAsia" w:hAnsiTheme="majorEastAsia" w:eastAsiaTheme="majorEastAsia" w:cstheme="majorEastAsia"/>
-          <w:b/>
-          <w:bCs/>
-          <w:color w:val="002060"/>
-          <w:sz w:val="28"/>
-          <w:szCs w:val="28"/>
-        </w:rPr>
-      </w:pPr>
-      <w:r>
-        <w:rPr>
-          <w:rFonts w:hint="eastAsia" w:asciiTheme="majorEastAsia" w:hAnsiTheme="majorEastAsia" w:eastAsiaTheme="majorEastAsia" w:cstheme="majorEastAsia"/>
-          <w:b/>
-          <w:bCs/>
-          <w:color w:val="002060"/>
-          <w:sz w:val="28"/>
-          <w:szCs w:val="28"/>
-        </w:rPr>
-        <w:t>Chapter 1: Introduction</w:t>
-      </w:r>
-    </w:p>
-    <w:p>
-      <w:pPr>
-        <w:ind w:left="0" w:leftChars="0" w:firstLine="402" w:firstLineChars="200"/>
-        <w:jc w:val="left"/>
-        <w:rPr>
-          <w:rFonts w:hint="default" w:asciiTheme="majorEastAsia" w:hAnsiTheme="majorEastAsia" w:eastAsiaTheme="majorEastAsia" w:cstheme="majorEastAsia"/>
-          <w:b/>
-          <w:bCs/>
           <w:color w:val="auto"/>
           <w:sz w:val="20"/>
           <w:szCs w:val="20"/>
         </w:rPr>
-      </w:pPr>
+        <w:t>&lt;Some introductions about main function&gt;</w:t>
+      </w:r>
     </w:p>
     <w:p>
       <w:pPr>
@@ -773,9 +710,9 @@
         </w:rPr>
         <w:drawing>
           <wp:inline distT="0" distB="0" distL="114300" distR="114300">
-            <wp:extent cx="5106670" cy="3678555"/>
-            <wp:effectExtent l="0" t="0" r="17780" b="17145"/>
-            <wp:docPr id="3" name="Picture 3" descr="/home/long-nguyen/proj_snake/docs/block_diagram/snake_top.pngsnake_top"/>
+            <wp:extent cx="5105400" cy="3671570"/>
+            <wp:effectExtent l="0" t="0" r="0" b="5080"/>
+            <wp:docPr id="3" name="Picture 3" descr="/home/long-nguyen/work/snake/docs/block_diagram/snake_top.pngsnake_top"/>
             <wp:cNvGraphicFramePr>
               <a:graphicFrameLocks xmlns:a="http://schemas.openxmlformats.org/drawingml/2006/main" noChangeAspect="1"/>
             </wp:cNvGraphicFramePr>
@@ -783,7 +720,7 @@
               <a:graphicData uri="http://schemas.openxmlformats.org/drawingml/2006/picture">
                 <pic:pic xmlns:pic="http://schemas.openxmlformats.org/drawingml/2006/picture">
                   <pic:nvPicPr>
-                    <pic:cNvPr id="3" name="Picture 3" descr="/home/long-nguyen/proj_snake/docs/block_diagram/snake_top.pngsnake_top"/>
+                    <pic:cNvPr id="3" name="Picture 3" descr="/home/long-nguyen/work/snake/docs/block_diagram/snake_top.pngsnake_top"/>
                     <pic:cNvPicPr>
                       <a:picLocks noChangeAspect="1"/>
                     </pic:cNvPicPr>
@@ -798,7 +735,7 @@
                   <pic:spPr>
                     <a:xfrm>
                       <a:off x="0" y="0"/>
-                      <a:ext cx="5106670" cy="3678555"/>
+                      <a:ext cx="5105400" cy="3671570"/>
                     </a:xfrm>
                     <a:prstGeom prst="rect">
                       <a:avLst/>
@@ -830,7 +767,7 @@
           <w:rFonts w:hint="eastAsia" w:asciiTheme="minorEastAsia" w:hAnsiTheme="minorEastAsia" w:eastAsiaTheme="minorEastAsia" w:cstheme="minorEastAsia"/>
           <w:color w:val="002060"/>
         </w:rPr>
-        <w:t xml:space="preserve">Table </w:t>
+        <w:t xml:space="preserve">Figure </w:t>
       </w:r>
       <w:r>
         <w:rPr>
@@ -844,7 +781,7 @@
           <w:rFonts w:hint="eastAsia" w:asciiTheme="minorEastAsia" w:hAnsiTheme="minorEastAsia" w:eastAsiaTheme="minorEastAsia" w:cstheme="minorEastAsia"/>
           <w:color w:val="002060"/>
         </w:rPr>
-        <w:instrText xml:space="preserve"> SEQ Table \* ARABIC </w:instrText>
+        <w:instrText xml:space="preserve"> SEQ Figure \* ARABIC </w:instrText>
       </w:r>
       <w:r>
         <w:rPr>
@@ -872,32 +809,7 @@
           <w:rFonts w:hint="eastAsia" w:asciiTheme="minorEastAsia" w:hAnsiTheme="minorEastAsia" w:eastAsiaTheme="minorEastAsia" w:cstheme="minorEastAsia"/>
           <w:color w:val="002060"/>
         </w:rPr>
-        <w:t xml:space="preserve"> - Snake Top block diagram</w:t>
-      </w:r>
-    </w:p>
-    <w:p>
-      <w:pPr>
-        <w:ind w:left="0" w:leftChars="0" w:firstLine="400" w:firstLineChars="200"/>
-        <w:jc w:val="left"/>
-        <w:rPr>
-          <w:rFonts w:hint="default" w:asciiTheme="majorEastAsia" w:hAnsiTheme="majorEastAsia" w:eastAsiaTheme="majorEastAsia" w:cstheme="majorEastAsia"/>
-          <w:b w:val="0"/>
-          <w:bCs w:val="0"/>
-          <w:color w:val="auto"/>
-          <w:sz w:val="20"/>
-          <w:szCs w:val="20"/>
-        </w:rPr>
-      </w:pPr>
-      <w:r>
-        <w:rPr>
-          <w:rFonts w:hint="default" w:asciiTheme="majorEastAsia" w:hAnsiTheme="majorEastAsia" w:eastAsiaTheme="majorEastAsia" w:cstheme="majorEastAsia"/>
-          <w:b w:val="0"/>
-          <w:bCs w:val="0"/>
-          <w:color w:val="auto"/>
-          <w:sz w:val="20"/>
-          <w:szCs w:val="20"/>
-        </w:rPr>
-        <w:t>&lt;Some introductions about main function&gt;</w:t>
+        <w:t xml:space="preserve"> - Top block diagram</w:t>
       </w:r>
     </w:p>
     <w:p>
@@ -1020,50 +932,6 @@
         </w:rPr>
         <w:t>Peripherals: I2C, UART, SPI, GPIO</w:t>
       </w:r>
-    </w:p>
-    <w:p>
-      <w:pPr>
-        <w:numPr>
-          <w:ilvl w:val="0"/>
-          <w:numId w:val="1"/>
-        </w:numPr>
-        <w:tabs>
-          <w:tab w:val="clear" w:pos="420"/>
-        </w:tabs>
-        <w:ind w:left="400" w:leftChars="0" w:hanging="400" w:firstLineChars="0"/>
-        <w:jc w:val="left"/>
-        <w:rPr>
-          <w:rFonts w:hint="eastAsia" w:asciiTheme="majorEastAsia" w:hAnsiTheme="majorEastAsia" w:eastAsiaTheme="majorEastAsia" w:cstheme="majorEastAsia"/>
-          <w:b w:val="0"/>
-          <w:bCs w:val="0"/>
-          <w:color w:val="1F4E79" w:themeColor="accent1" w:themeShade="80"/>
-          <w:sz w:val="22"/>
-          <w:szCs w:val="22"/>
-        </w:rPr>
-      </w:pPr>
-      <w:r>
-        <w:rPr>
-          <w:rFonts w:hint="default" w:asciiTheme="majorEastAsia" w:hAnsiTheme="majorEastAsia" w:eastAsiaTheme="majorEastAsia" w:cstheme="majorEastAsia"/>
-          <w:b w:val="0"/>
-          <w:bCs w:val="0"/>
-          <w:color w:val="auto"/>
-          <w:sz w:val="20"/>
-          <w:szCs w:val="20"/>
-        </w:rPr>
-        <w:t>Resuable modules (each section in chapter ... can be reused as an independent design document of the corresponding top module mentioned in that section)</w:t>
-      </w:r>
-    </w:p>
-    <w:p>
-      <w:pPr>
-        <w:rPr>
-          <w:rFonts w:hint="eastAsia" w:asciiTheme="majorEastAsia" w:hAnsiTheme="majorEastAsia" w:eastAsiaTheme="majorEastAsia" w:cstheme="majorEastAsia"/>
-          <w:b w:val="0"/>
-          <w:bCs w:val="0"/>
-          <w:color w:val="auto"/>
-          <w:sz w:val="20"/>
-          <w:szCs w:val="20"/>
-        </w:rPr>
-      </w:pPr>
       <w:r>
         <w:rPr>
           <w:rFonts w:hint="eastAsia" w:asciiTheme="majorEastAsia" w:hAnsiTheme="majorEastAsia" w:eastAsiaTheme="majorEastAsia" w:cstheme="majorEastAsia"/>
@@ -1112,7 +980,7 @@
           <w:numId w:val="2"/>
         </w:numPr>
         <w:jc w:val="left"/>
-        <w:outlineLvl w:val="0"/>
+        <w:outlineLvl w:val="1"/>
         <w:rPr>
           <w:rFonts w:hint="eastAsia" w:asciiTheme="majorEastAsia" w:hAnsiTheme="majorEastAsia" w:eastAsiaTheme="majorEastAsia" w:cstheme="majorEastAsia"/>
           <w:b/>
@@ -1132,6 +1000,78 @@
           <w:szCs w:val="24"/>
         </w:rPr>
         <w:t>Defines</w:t>
+      </w:r>
+    </w:p>
+    <w:p>
+      <w:pPr>
+        <w:pStyle w:val="2"/>
+        <w:rPr>
+          <w:rFonts w:hint="eastAsia" w:asciiTheme="minorEastAsia" w:hAnsiTheme="minorEastAsia" w:eastAsiaTheme="minorEastAsia" w:cstheme="minorEastAsia"/>
+          <w:color w:val="002060"/>
+        </w:rPr>
+      </w:pPr>
+      <w:r>
+        <w:rPr>
+          <w:rFonts w:hint="eastAsia" w:asciiTheme="minorEastAsia" w:hAnsiTheme="minorEastAsia" w:eastAsiaTheme="minorEastAsia" w:cstheme="minorEastAsia"/>
+          <w:color w:val="002060"/>
+        </w:rPr>
+        <w:t xml:space="preserve">Table </w:t>
+      </w:r>
+      <w:r>
+        <w:rPr>
+          <w:rFonts w:hint="eastAsia" w:asciiTheme="minorEastAsia" w:hAnsiTheme="minorEastAsia" w:eastAsiaTheme="minorEastAsia" w:cstheme="minorEastAsia"/>
+          <w:color w:val="002060"/>
+        </w:rPr>
+        <w:fldChar w:fldCharType="begin"/>
+      </w:r>
+      <w:r>
+        <w:rPr>
+          <w:rFonts w:hint="eastAsia" w:asciiTheme="minorEastAsia" w:hAnsiTheme="minorEastAsia" w:eastAsiaTheme="minorEastAsia" w:cstheme="minorEastAsia"/>
+          <w:color w:val="002060"/>
+        </w:rPr>
+        <w:instrText xml:space="preserve"> SEQ Table \* ARABIC </w:instrText>
+      </w:r>
+      <w:r>
+        <w:rPr>
+          <w:rFonts w:hint="eastAsia" w:asciiTheme="minorEastAsia" w:hAnsiTheme="minorEastAsia" w:eastAsiaTheme="minorEastAsia" w:cstheme="minorEastAsia"/>
+          <w:color w:val="002060"/>
+        </w:rPr>
+        <w:fldChar w:fldCharType="separate"/>
+      </w:r>
+      <w:r>
+        <w:rPr>
+          <w:rFonts w:hint="eastAsia" w:asciiTheme="minorEastAsia" w:hAnsiTheme="minorEastAsia" w:eastAsiaTheme="minorEastAsia" w:cstheme="minorEastAsia"/>
+          <w:color w:val="002060"/>
+        </w:rPr>
+        <w:t>1</w:t>
+      </w:r>
+      <w:r>
+        <w:rPr>
+          <w:rFonts w:hint="eastAsia" w:asciiTheme="minorEastAsia" w:hAnsiTheme="minorEastAsia" w:eastAsiaTheme="minorEastAsia" w:cstheme="minorEastAsia"/>
+          <w:color w:val="002060"/>
+        </w:rPr>
+        <w:fldChar w:fldCharType="end"/>
+      </w:r>
+      <w:r>
+        <w:rPr>
+          <w:rFonts w:hint="eastAsia" w:asciiTheme="minorEastAsia" w:hAnsiTheme="minorEastAsia" w:eastAsiaTheme="minorEastAsia" w:cstheme="minorEastAsia"/>
+          <w:color w:val="002060"/>
+        </w:rPr>
+        <w:t xml:space="preserve"> - </w:t>
+      </w:r>
+      <w:r>
+        <w:rPr>
+          <w:rFonts w:hint="default" w:asciiTheme="minorEastAsia" w:hAnsiTheme="minorEastAsia" w:eastAsiaTheme="minorEastAsia" w:cstheme="minorEastAsia"/>
+          <w:color w:val="002060"/>
+        </w:rPr>
+        <w:t>Top</w:t>
+      </w:r>
+      <w:r>
+        <w:rPr>
+          <w:rFonts w:hint="eastAsia" w:asciiTheme="minorEastAsia" w:hAnsiTheme="minorEastAsia" w:eastAsiaTheme="minorEastAsia" w:cstheme="minorEastAsia"/>
+          <w:color w:val="002060"/>
+        </w:rPr>
+        <w:t xml:space="preserve"> define macros</w:t>
       </w:r>
     </w:p>
     <w:tbl>
@@ -1548,7 +1488,7 @@
           <w:numId w:val="2"/>
         </w:numPr>
         <w:jc w:val="left"/>
-        <w:outlineLvl w:val="0"/>
+        <w:outlineLvl w:val="1"/>
         <w:rPr>
           <w:rFonts w:hint="eastAsia" w:asciiTheme="majorEastAsia" w:hAnsiTheme="majorEastAsia" w:eastAsiaTheme="majorEastAsia" w:cstheme="majorEastAsia"/>
           <w:b/>
@@ -1568,6 +1508,78 @@
           <w:szCs w:val="24"/>
         </w:rPr>
         <w:t>Parameters</w:t>
+      </w:r>
+    </w:p>
+    <w:p>
+      <w:pPr>
+        <w:pStyle w:val="2"/>
+        <w:rPr>
+          <w:rFonts w:hint="eastAsia" w:asciiTheme="minorEastAsia" w:hAnsiTheme="minorEastAsia" w:eastAsiaTheme="minorEastAsia" w:cstheme="minorEastAsia"/>
+          <w:color w:val="002060"/>
+        </w:rPr>
+      </w:pPr>
+      <w:r>
+        <w:rPr>
+          <w:rFonts w:hint="eastAsia" w:asciiTheme="minorEastAsia" w:hAnsiTheme="minorEastAsia" w:eastAsiaTheme="minorEastAsia" w:cstheme="minorEastAsia"/>
+          <w:color w:val="002060"/>
+        </w:rPr>
+        <w:t xml:space="preserve">Table </w:t>
+      </w:r>
+      <w:r>
+        <w:rPr>
+          <w:rFonts w:hint="eastAsia" w:asciiTheme="minorEastAsia" w:hAnsiTheme="minorEastAsia" w:eastAsiaTheme="minorEastAsia" w:cstheme="minorEastAsia"/>
+          <w:color w:val="002060"/>
+        </w:rPr>
+        <w:fldChar w:fldCharType="begin"/>
+      </w:r>
+      <w:r>
+        <w:rPr>
+          <w:rFonts w:hint="eastAsia" w:asciiTheme="minorEastAsia" w:hAnsiTheme="minorEastAsia" w:eastAsiaTheme="minorEastAsia" w:cstheme="minorEastAsia"/>
+          <w:color w:val="002060"/>
+        </w:rPr>
+        <w:instrText xml:space="preserve"> SEQ Table \* ARABIC </w:instrText>
+      </w:r>
+      <w:r>
+        <w:rPr>
+          <w:rFonts w:hint="eastAsia" w:asciiTheme="minorEastAsia" w:hAnsiTheme="minorEastAsia" w:eastAsiaTheme="minorEastAsia" w:cstheme="minorEastAsia"/>
+          <w:color w:val="002060"/>
+        </w:rPr>
+        <w:fldChar w:fldCharType="separate"/>
+      </w:r>
+      <w:r>
+        <w:rPr>
+          <w:rFonts w:hint="eastAsia" w:asciiTheme="minorEastAsia" w:hAnsiTheme="minorEastAsia" w:eastAsiaTheme="minorEastAsia" w:cstheme="minorEastAsia"/>
+          <w:color w:val="002060"/>
+        </w:rPr>
+        <w:t>2</w:t>
+      </w:r>
+      <w:r>
+        <w:rPr>
+          <w:rFonts w:hint="eastAsia" w:asciiTheme="minorEastAsia" w:hAnsiTheme="minorEastAsia" w:eastAsiaTheme="minorEastAsia" w:cstheme="minorEastAsia"/>
+          <w:color w:val="002060"/>
+        </w:rPr>
+        <w:fldChar w:fldCharType="end"/>
+      </w:r>
+      <w:r>
+        <w:rPr>
+          <w:rFonts w:hint="eastAsia" w:asciiTheme="minorEastAsia" w:hAnsiTheme="minorEastAsia" w:eastAsiaTheme="minorEastAsia" w:cstheme="minorEastAsia"/>
+          <w:color w:val="002060"/>
+        </w:rPr>
+        <w:t xml:space="preserve"> - </w:t>
+      </w:r>
+      <w:r>
+        <w:rPr>
+          <w:rFonts w:hint="default" w:asciiTheme="minorEastAsia" w:hAnsiTheme="minorEastAsia" w:eastAsiaTheme="minorEastAsia" w:cstheme="minorEastAsia"/>
+          <w:color w:val="002060"/>
+        </w:rPr>
+        <w:t>Top</w:t>
+      </w:r>
+      <w:r>
+        <w:rPr>
+          <w:rFonts w:hint="eastAsia" w:asciiTheme="minorEastAsia" w:hAnsiTheme="minorEastAsia" w:eastAsiaTheme="minorEastAsia" w:cstheme="minorEastAsia"/>
+          <w:color w:val="002060"/>
+        </w:rPr>
+        <w:t xml:space="preserve"> parameters</w:t>
       </w:r>
     </w:p>
     <w:tbl>
@@ -1979,7 +1991,7 @@
           <w:sz w:val="20"/>
           <w:szCs w:val="20"/>
         </w:rPr>
-        <w:t>: each section () in this chapter can be reused as an independent design document of the corresponding top module mentioned in that section.</w:t>
+        <w:t>: For reuse purpose - each section () in this chapter can be reused as an independent design document of the corresponding top module mentioned in that section.</w:t>
       </w:r>
     </w:p>
     <w:p>
@@ -2030,7 +2042,7 @@
           <w:bCs/>
           <w:i w:val="0"/>
           <w:iCs w:val="0"/>
-          <w:color w:val="auto"/>
+          <w:color w:val="002060"/>
           <w:sz w:val="20"/>
           <w:szCs w:val="20"/>
         </w:rPr>
@@ -2042,7 +2054,7 @@
           <w:bCs/>
           <w:i w:val="0"/>
           <w:iCs w:val="0"/>
-          <w:color w:val="auto"/>
+          <w:color w:val="002060"/>
           <w:sz w:val="20"/>
           <w:szCs w:val="20"/>
         </w:rPr>
@@ -2083,7 +2095,7 @@
           <w:bCs/>
           <w:i w:val="0"/>
           <w:iCs w:val="0"/>
-          <w:color w:val="auto"/>
+          <w:color w:val="002060"/>
           <w:sz w:val="20"/>
           <w:szCs w:val="20"/>
         </w:rPr>
@@ -2095,11 +2107,69 @@
           <w:bCs/>
           <w:i w:val="0"/>
           <w:iCs w:val="0"/>
-          <w:color w:val="auto"/>
+          <w:color w:val="002060"/>
           <w:sz w:val="20"/>
           <w:szCs w:val="20"/>
         </w:rPr>
         <w:t>Port List</w:t>
+      </w:r>
+    </w:p>
+    <w:p>
+      <w:pPr>
+        <w:pStyle w:val="2"/>
+        <w:rPr>
+          <w:rFonts w:hint="eastAsia" w:asciiTheme="minorEastAsia" w:hAnsiTheme="minorEastAsia" w:eastAsiaTheme="minorEastAsia" w:cstheme="minorEastAsia"/>
+          <w:color w:val="002060"/>
+        </w:rPr>
+      </w:pPr>
+      <w:r>
+        <w:rPr>
+          <w:rFonts w:hint="eastAsia" w:asciiTheme="minorEastAsia" w:hAnsiTheme="minorEastAsia" w:eastAsiaTheme="minorEastAsia" w:cstheme="minorEastAsia"/>
+          <w:color w:val="002060"/>
+        </w:rPr>
+        <w:t xml:space="preserve">Table </w:t>
+      </w:r>
+      <w:r>
+        <w:rPr>
+          <w:rFonts w:hint="eastAsia" w:asciiTheme="minorEastAsia" w:hAnsiTheme="minorEastAsia" w:eastAsiaTheme="minorEastAsia" w:cstheme="minorEastAsia"/>
+          <w:color w:val="002060"/>
+        </w:rPr>
+        <w:fldChar w:fldCharType="begin"/>
+      </w:r>
+      <w:r>
+        <w:rPr>
+          <w:rFonts w:hint="eastAsia" w:asciiTheme="minorEastAsia" w:hAnsiTheme="minorEastAsia" w:eastAsiaTheme="minorEastAsia" w:cstheme="minorEastAsia"/>
+          <w:color w:val="002060"/>
+        </w:rPr>
+        <w:instrText xml:space="preserve"> SEQ Table \* ARABIC </w:instrText>
+      </w:r>
+      <w:r>
+        <w:rPr>
+          <w:rFonts w:hint="eastAsia" w:asciiTheme="minorEastAsia" w:hAnsiTheme="minorEastAsia" w:eastAsiaTheme="minorEastAsia" w:cstheme="minorEastAsia"/>
+          <w:color w:val="002060"/>
+        </w:rPr>
+        <w:fldChar w:fldCharType="separate"/>
+      </w:r>
+      <w:r>
+        <w:rPr>
+          <w:rFonts w:hint="eastAsia" w:asciiTheme="minorEastAsia" w:hAnsiTheme="minorEastAsia" w:eastAsiaTheme="minorEastAsia" w:cstheme="minorEastAsia"/>
+          <w:color w:val="002060"/>
+        </w:rPr>
+        <w:t>3</w:t>
+      </w:r>
+      <w:r>
+        <w:rPr>
+          <w:rFonts w:hint="eastAsia" w:asciiTheme="minorEastAsia" w:hAnsiTheme="minorEastAsia" w:eastAsiaTheme="minorEastAsia" w:cstheme="minorEastAsia"/>
+          <w:color w:val="002060"/>
+        </w:rPr>
+        <w:fldChar w:fldCharType="end"/>
+      </w:r>
+      <w:r>
+        <w:rPr>
+          <w:rFonts w:hint="eastAsia" w:asciiTheme="minorEastAsia" w:hAnsiTheme="minorEastAsia" w:eastAsiaTheme="minorEastAsia" w:cstheme="minorEastAsia"/>
+          <w:color w:val="002060"/>
+        </w:rPr>
+        <w:t xml:space="preserve"> - Top port list</w:t>
       </w:r>
     </w:p>
     <w:tbl>
@@ -2668,8 +2738,6 @@
               </w:rPr>
               <w:t>MCU clock - 500MHz</w:t>
             </w:r>
-            <w:bookmarkStart w:id="0" w:name="_GoBack"/>
-            <w:bookmarkEnd w:id="0"/>
           </w:p>
         </w:tc>
       </w:tr>
@@ -4429,7 +4497,174 @@
           <w:sz w:val="20"/>
           <w:szCs w:val="20"/>
         </w:rPr>
-        <w:t>...</w:t>
+        <w:t>Addressmap</w:t>
+      </w:r>
+    </w:p>
+    <w:p>
+      <w:pPr>
+        <w:numPr>
+          <w:ilvl w:val="0"/>
+          <w:numId w:val="3"/>
+        </w:numPr>
+        <w:jc w:val="left"/>
+        <w:outlineLvl w:val="0"/>
+        <w:rPr>
+          <w:rFonts w:hint="eastAsia" w:asciiTheme="majorEastAsia" w:hAnsiTheme="majorEastAsia" w:eastAsiaTheme="majorEastAsia" w:cstheme="majorEastAsia"/>
+          <w:b/>
+          <w:bCs/>
+          <w:i w:val="0"/>
+          <w:iCs w:val="0"/>
+          <w:color w:val="auto"/>
+          <w:sz w:val="20"/>
+          <w:szCs w:val="20"/>
+        </w:rPr>
+      </w:pPr>
+      <w:r>
+        <w:rPr>
+          <w:rFonts w:hint="default" w:asciiTheme="majorEastAsia" w:hAnsiTheme="majorEastAsia" w:eastAsiaTheme="majorEastAsia" w:cstheme="majorEastAsia"/>
+          <w:b/>
+          <w:bCs/>
+          <w:i w:val="0"/>
+          <w:iCs w:val="0"/>
+          <w:color w:val="auto"/>
+          <w:sz w:val="20"/>
+          <w:szCs w:val="20"/>
+        </w:rPr>
+        <w:t>RISC-V Core</w:t>
+      </w:r>
+    </w:p>
+    <w:p>
+      <w:pPr>
+        <w:numPr>
+          <w:ilvl w:val="1"/>
+          <w:numId w:val="3"/>
+        </w:numPr>
+        <w:ind w:left="0" w:leftChars="0" w:firstLine="0" w:firstLineChars="0"/>
+        <w:jc w:val="left"/>
+        <w:outlineLvl w:val="0"/>
+        <w:rPr>
+          <w:rFonts w:hint="eastAsia" w:asciiTheme="majorEastAsia" w:hAnsiTheme="majorEastAsia" w:eastAsiaTheme="majorEastAsia" w:cstheme="majorEastAsia"/>
+          <w:b/>
+          <w:bCs/>
+          <w:i w:val="0"/>
+          <w:iCs w:val="0"/>
+          <w:color w:val="auto"/>
+          <w:sz w:val="20"/>
+          <w:szCs w:val="20"/>
+        </w:rPr>
+      </w:pPr>
+      <w:r>
+        <w:rPr>
+          <w:rFonts w:hint="default" w:asciiTheme="majorEastAsia" w:hAnsiTheme="majorEastAsia" w:eastAsiaTheme="majorEastAsia" w:cstheme="majorEastAsia"/>
+          <w:b/>
+          <w:bCs/>
+          <w:i w:val="0"/>
+          <w:iCs w:val="0"/>
+          <w:color w:val="auto"/>
+          <w:sz w:val="20"/>
+          <w:szCs w:val="20"/>
+        </w:rPr>
+        <w:t>Boot ROM</w:t>
+      </w:r>
+    </w:p>
+    <w:p>
+      <w:pPr>
+        <w:numPr>
+          <w:ilvl w:val="1"/>
+          <w:numId w:val="3"/>
+        </w:numPr>
+        <w:ind w:left="0" w:leftChars="0" w:firstLine="0" w:firstLineChars="0"/>
+        <w:jc w:val="left"/>
+        <w:outlineLvl w:val="0"/>
+        <w:rPr>
+          <w:rFonts w:hint="eastAsia" w:asciiTheme="majorEastAsia" w:hAnsiTheme="majorEastAsia" w:eastAsiaTheme="majorEastAsia" w:cstheme="majorEastAsia"/>
+          <w:b/>
+          <w:bCs/>
+          <w:i w:val="0"/>
+          <w:iCs w:val="0"/>
+          <w:color w:val="auto"/>
+          <w:sz w:val="20"/>
+          <w:szCs w:val="20"/>
+        </w:rPr>
+      </w:pPr>
+      <w:r>
+        <w:rPr>
+          <w:rFonts w:hint="default" w:asciiTheme="majorEastAsia" w:hAnsiTheme="majorEastAsia" w:eastAsiaTheme="majorEastAsia" w:cstheme="majorEastAsia"/>
+          <w:b/>
+          <w:bCs/>
+          <w:i w:val="0"/>
+          <w:iCs w:val="0"/>
+          <w:color w:val="auto"/>
+          <w:sz w:val="20"/>
+          <w:szCs w:val="20"/>
+        </w:rPr>
+        <w:t>BRAM Controller</w:t>
+      </w:r>
+    </w:p>
+    <w:p>
+      <w:pPr>
+        <w:numPr>
+          <w:ilvl w:val="0"/>
+          <w:numId w:val="3"/>
+        </w:numPr>
+        <w:jc w:val="left"/>
+        <w:outlineLvl w:val="0"/>
+        <w:rPr>
+          <w:rFonts w:hint="eastAsia" w:asciiTheme="majorEastAsia" w:hAnsiTheme="majorEastAsia" w:eastAsiaTheme="majorEastAsia" w:cstheme="majorEastAsia"/>
+          <w:b/>
+          <w:bCs/>
+          <w:i w:val="0"/>
+          <w:iCs w:val="0"/>
+          <w:color w:val="auto"/>
+          <w:sz w:val="20"/>
+          <w:szCs w:val="20"/>
+        </w:rPr>
+      </w:pPr>
+      <w:r>
+        <w:rPr>
+          <w:rFonts w:hint="default" w:asciiTheme="majorEastAsia" w:hAnsiTheme="majorEastAsia" w:eastAsiaTheme="majorEastAsia" w:cstheme="majorEastAsia"/>
+          <w:b/>
+          <w:bCs/>
+          <w:i w:val="0"/>
+          <w:iCs w:val="0"/>
+          <w:color w:val="auto"/>
+          <w:sz w:val="20"/>
+          <w:szCs w:val="20"/>
+        </w:rPr>
+        <w:t>DMA</w:t>
+      </w:r>
+    </w:p>
+    <w:p>
+      <w:pPr>
+        <w:numPr>
+          <w:ilvl w:val="0"/>
+          <w:numId w:val="3"/>
+        </w:numPr>
+        <w:jc w:val="left"/>
+        <w:outlineLvl w:val="0"/>
+        <w:rPr>
+          <w:rFonts w:hint="eastAsia" w:asciiTheme="majorEastAsia" w:hAnsiTheme="majorEastAsia" w:eastAsiaTheme="majorEastAsia" w:cstheme="majorEastAsia"/>
+          <w:b/>
+          <w:bCs/>
+          <w:i w:val="0"/>
+          <w:iCs w:val="0"/>
+          <w:color w:val="auto"/>
+          <w:sz w:val="20"/>
+          <w:szCs w:val="20"/>
+        </w:rPr>
+      </w:pPr>
+      <w:r>
+        <w:rPr>
+          <w:rFonts w:hint="default" w:asciiTheme="majorEastAsia" w:hAnsiTheme="majorEastAsia" w:eastAsiaTheme="majorEastAsia" w:cstheme="majorEastAsia"/>
+          <w:b/>
+          <w:bCs/>
+          <w:i w:val="0"/>
+          <w:iCs w:val="0"/>
+          <w:color w:val="auto"/>
+          <w:sz w:val="20"/>
+          <w:szCs w:val="20"/>
+        </w:rPr>
+        <w:t>AHB</w:t>
       </w:r>
     </w:p>
     <w:p>
@@ -4442,8 +4677,8 @@
         <w:outlineLvl w:val="0"/>
         <w:rPr>
           <w:rFonts w:hint="eastAsia" w:asciiTheme="majorEastAsia" w:hAnsiTheme="majorEastAsia" w:eastAsiaTheme="majorEastAsia" w:cstheme="majorEastAsia"/>
-          <w:b/>
-          <w:bCs/>
+          <w:b w:val="0"/>
+          <w:bCs w:val="0"/>
           <w:i w:val="0"/>
           <w:iCs w:val="0"/>
           <w:color w:val="auto"/>
@@ -4451,6 +4686,1618 @@
           <w:szCs w:val="20"/>
         </w:rPr>
       </w:pPr>
+      <w:r>
+        <w:rPr>
+          <w:rFonts w:hint="default" w:asciiTheme="majorEastAsia" w:hAnsiTheme="majorEastAsia" w:eastAsiaTheme="majorEastAsia" w:cstheme="majorEastAsia"/>
+          <w:b w:val="0"/>
+          <w:bCs w:val="0"/>
+          <w:i w:val="0"/>
+          <w:iCs w:val="0"/>
+          <w:color w:val="auto"/>
+          <w:sz w:val="20"/>
+          <w:szCs w:val="20"/>
+        </w:rPr>
+        <w:t>&lt;Introduct&gt;</w:t>
+      </w:r>
+    </w:p>
+    <w:p>
+      <w:pPr>
+        <w:numPr>
+          <w:ilvl w:val="1"/>
+          <w:numId w:val="3"/>
+        </w:numPr>
+        <w:ind w:left="0" w:leftChars="0" w:firstLine="0" w:firstLineChars="0"/>
+        <w:jc w:val="left"/>
+        <w:outlineLvl w:val="0"/>
+        <w:rPr>
+          <w:rFonts w:hint="eastAsia" w:asciiTheme="majorEastAsia" w:hAnsiTheme="majorEastAsia" w:eastAsiaTheme="majorEastAsia" w:cstheme="majorEastAsia"/>
+          <w:b/>
+          <w:bCs/>
+          <w:i w:val="0"/>
+          <w:iCs w:val="0"/>
+          <w:color w:val="auto"/>
+          <w:sz w:val="20"/>
+          <w:szCs w:val="20"/>
+        </w:rPr>
+      </w:pPr>
+      <w:r>
+        <w:rPr>
+          <w:rFonts w:hint="default" w:asciiTheme="majorEastAsia" w:hAnsiTheme="majorEastAsia" w:eastAsiaTheme="majorEastAsia" w:cstheme="majorEastAsia"/>
+          <w:b/>
+          <w:bCs/>
+          <w:i w:val="0"/>
+          <w:iCs w:val="0"/>
+          <w:color w:val="auto"/>
+          <w:sz w:val="20"/>
+          <w:szCs w:val="20"/>
+        </w:rPr>
+        <w:t>AHB Interconnect</w:t>
+      </w:r>
+    </w:p>
+    <w:p>
+      <w:pPr>
+        <w:numPr>
+          <w:ilvl w:val="0"/>
+          <w:numId w:val="0"/>
+        </w:numPr>
+        <w:jc w:val="left"/>
+        <w:outlineLvl w:val="0"/>
+        <w:rPr>
+          <w:rFonts w:hint="eastAsia" w:asciiTheme="majorEastAsia" w:hAnsiTheme="majorEastAsia" w:eastAsiaTheme="majorEastAsia" w:cstheme="majorEastAsia"/>
+          <w:b/>
+          <w:bCs/>
+          <w:i w:val="0"/>
+          <w:iCs w:val="0"/>
+          <w:color w:val="auto"/>
+          <w:sz w:val="20"/>
+          <w:szCs w:val="20"/>
+        </w:rPr>
+      </w:pPr>
+    </w:p>
+    <w:p>
+      <w:pPr>
+        <w:numPr>
+          <w:ilvl w:val="2"/>
+          <w:numId w:val="3"/>
+        </w:numPr>
+        <w:ind w:left="0" w:leftChars="0" w:firstLine="0" w:firstLineChars="0"/>
+        <w:jc w:val="left"/>
+        <w:outlineLvl w:val="0"/>
+        <w:rPr>
+          <w:rFonts w:hint="eastAsia" w:asciiTheme="majorEastAsia" w:hAnsiTheme="majorEastAsia" w:eastAsiaTheme="majorEastAsia" w:cstheme="majorEastAsia"/>
+          <w:b/>
+          <w:bCs/>
+          <w:i w:val="0"/>
+          <w:iCs w:val="0"/>
+          <w:color w:val="auto"/>
+          <w:sz w:val="20"/>
+          <w:szCs w:val="20"/>
+        </w:rPr>
+      </w:pPr>
+      <w:r>
+        <w:rPr>
+          <w:rFonts w:hint="default" w:asciiTheme="majorEastAsia" w:hAnsiTheme="majorEastAsia" w:eastAsiaTheme="majorEastAsia" w:cstheme="majorEastAsia"/>
+          <w:b/>
+          <w:bCs/>
+          <w:i w:val="0"/>
+          <w:iCs w:val="0"/>
+          <w:color w:val="auto"/>
+          <w:sz w:val="20"/>
+          <w:szCs w:val="20"/>
+        </w:rPr>
+        <w:t>Design Configurations</w:t>
+      </w:r>
+    </w:p>
+    <w:p>
+      <w:pPr>
+        <w:numPr>
+          <w:numId w:val="0"/>
+        </w:numPr>
+        <w:jc w:val="left"/>
+        <w:outlineLvl w:val="0"/>
+        <w:rPr>
+          <w:rFonts w:hint="eastAsia" w:asciiTheme="majorEastAsia" w:hAnsiTheme="majorEastAsia" w:eastAsiaTheme="majorEastAsia" w:cstheme="majorEastAsia"/>
+          <w:b/>
+          <w:bCs/>
+          <w:i w:val="0"/>
+          <w:iCs w:val="0"/>
+          <w:color w:val="auto"/>
+          <w:sz w:val="20"/>
+          <w:szCs w:val="20"/>
+        </w:rPr>
+      </w:pPr>
+    </w:p>
+    <w:p>
+      <w:pPr>
+        <w:numPr>
+          <w:ilvl w:val="2"/>
+          <w:numId w:val="3"/>
+        </w:numPr>
+        <w:ind w:left="0" w:leftChars="0" w:firstLine="0" w:firstLineChars="0"/>
+        <w:jc w:val="left"/>
+        <w:outlineLvl w:val="0"/>
+        <w:rPr>
+          <w:rFonts w:hint="eastAsia" w:asciiTheme="majorEastAsia" w:hAnsiTheme="majorEastAsia" w:eastAsiaTheme="majorEastAsia" w:cstheme="majorEastAsia"/>
+          <w:b/>
+          <w:bCs/>
+          <w:i w:val="0"/>
+          <w:iCs w:val="0"/>
+          <w:color w:val="auto"/>
+          <w:sz w:val="20"/>
+          <w:szCs w:val="20"/>
+        </w:rPr>
+      </w:pPr>
+      <w:r>
+        <w:rPr>
+          <w:rFonts w:hint="default" w:asciiTheme="majorEastAsia" w:hAnsiTheme="majorEastAsia" w:eastAsiaTheme="majorEastAsia" w:cstheme="majorEastAsia"/>
+          <w:b/>
+          <w:bCs/>
+          <w:i w:val="0"/>
+          <w:iCs w:val="0"/>
+          <w:color w:val="auto"/>
+          <w:sz w:val="20"/>
+          <w:szCs w:val="20"/>
+        </w:rPr>
+        <w:t>Port List</w:t>
+      </w:r>
+    </w:p>
+    <w:tbl>
+      <w:tblPr>
+        <w:tblStyle w:val="5"/>
+        <w:tblW w:w="8454" w:type="dxa"/>
+        <w:tblInd w:w="0" w:type="dxa"/>
+        <w:tblBorders>
+          <w:top w:val="single" w:color="auto" w:sz="4" w:space="0"/>
+          <w:left w:val="single" w:color="auto" w:sz="4" w:space="0"/>
+          <w:bottom w:val="single" w:color="auto" w:sz="4" w:space="0"/>
+          <w:right w:val="single" w:color="auto" w:sz="4" w:space="0"/>
+          <w:insideH w:val="single" w:color="auto" w:sz="4" w:space="0"/>
+          <w:insideV w:val="single" w:color="auto" w:sz="4" w:space="0"/>
+        </w:tblBorders>
+        <w:shd w:val="clear" w:color="auto" w:fill="auto"/>
+        <w:tblLayout w:type="fixed"/>
+        <w:tblCellMar>
+          <w:top w:w="0" w:type="dxa"/>
+          <w:left w:w="108" w:type="dxa"/>
+          <w:bottom w:w="0" w:type="dxa"/>
+          <w:right w:w="108" w:type="dxa"/>
+        </w:tblCellMar>
+      </w:tblPr>
+      <w:tblGrid>
+        <w:gridCol w:w="2319"/>
+        <w:gridCol w:w="840"/>
+        <w:gridCol w:w="840"/>
+        <w:gridCol w:w="4455"/>
+      </w:tblGrid>
+      <w:tr>
+        <w:tblPrEx>
+          <w:tblBorders>
+            <w:top w:val="single" w:color="auto" w:sz="4" w:space="0"/>
+            <w:left w:val="single" w:color="auto" w:sz="4" w:space="0"/>
+            <w:bottom w:val="single" w:color="auto" w:sz="4" w:space="0"/>
+            <w:right w:val="single" w:color="auto" w:sz="4" w:space="0"/>
+            <w:insideH w:val="single" w:color="auto" w:sz="4" w:space="0"/>
+            <w:insideV w:val="single" w:color="auto" w:sz="4" w:space="0"/>
+          </w:tblBorders>
+          <w:shd w:val="clear" w:color="auto" w:fill="auto"/>
+          <w:tblLayout w:type="fixed"/>
+          <w:tblCellMar>
+            <w:top w:w="0" w:type="dxa"/>
+            <w:left w:w="108" w:type="dxa"/>
+            <w:bottom w:w="0" w:type="dxa"/>
+            <w:right w:w="108" w:type="dxa"/>
+          </w:tblCellMar>
+        </w:tblPrEx>
+        <w:trPr>
+          <w:trHeight w:val="302" w:hRule="atLeast"/>
+        </w:trPr>
+        <w:tc>
+          <w:tcPr>
+            <w:tcW w:w="2319" w:type="dxa"/>
+            <w:tcBorders>
+              <w:tl2br w:val="nil"/>
+              <w:tr2bl w:val="nil"/>
+            </w:tcBorders>
+            <w:shd w:val="clear" w:color="auto" w:fill="A5A5A5" w:themeFill="accent3"/>
+            <w:vAlign w:val="center"/>
+          </w:tcPr>
+          <w:p>
+            <w:pPr>
+              <w:widowControl w:val="0"/>
+              <w:jc w:val="both"/>
+              <w:rPr>
+                <w:rFonts w:hint="eastAsia" w:asciiTheme="majorEastAsia" w:hAnsiTheme="majorEastAsia" w:eastAsiaTheme="majorEastAsia" w:cstheme="majorEastAsia"/>
+                <w:b/>
+                <w:bCs/>
+                <w:color w:val="002060"/>
+                <w:sz w:val="20"/>
+                <w:szCs w:val="20"/>
+                <w:shd w:val="clear" w:color="auto" w:fill="auto"/>
+                <w:vertAlign w:val="baseline"/>
+              </w:rPr>
+            </w:pPr>
+            <w:r>
+              <w:rPr>
+                <w:rFonts w:hint="default" w:asciiTheme="majorEastAsia" w:hAnsiTheme="majorEastAsia" w:eastAsiaTheme="majorEastAsia" w:cstheme="majorEastAsia"/>
+                <w:b/>
+                <w:bCs/>
+                <w:color w:val="002060"/>
+                <w:sz w:val="20"/>
+                <w:szCs w:val="20"/>
+                <w:shd w:val="clear" w:color="auto" w:fill="auto"/>
+                <w:vertAlign w:val="baseline"/>
+              </w:rPr>
+              <w:t>Port name</w:t>
+            </w:r>
+          </w:p>
+        </w:tc>
+        <w:tc>
+          <w:tcPr>
+            <w:tcW w:w="840" w:type="dxa"/>
+            <w:tcBorders>
+              <w:tl2br w:val="nil"/>
+              <w:tr2bl w:val="nil"/>
+            </w:tcBorders>
+            <w:shd w:val="clear" w:color="auto" w:fill="A5A5A5" w:themeFill="accent3"/>
+            <w:vAlign w:val="center"/>
+          </w:tcPr>
+          <w:p>
+            <w:pPr>
+              <w:widowControl w:val="0"/>
+              <w:jc w:val="both"/>
+              <w:rPr>
+                <w:rFonts w:hint="default" w:asciiTheme="majorEastAsia" w:hAnsiTheme="majorEastAsia" w:eastAsiaTheme="majorEastAsia" w:cstheme="majorEastAsia"/>
+                <w:b/>
+                <w:bCs/>
+                <w:color w:val="002060"/>
+                <w:sz w:val="20"/>
+                <w:szCs w:val="20"/>
+                <w:shd w:val="clear" w:color="auto" w:fill="auto"/>
+                <w:vertAlign w:val="baseline"/>
+              </w:rPr>
+            </w:pPr>
+            <w:r>
+              <w:rPr>
+                <w:rFonts w:hint="default" w:asciiTheme="majorEastAsia" w:hAnsiTheme="majorEastAsia" w:eastAsiaTheme="majorEastAsia" w:cstheme="majorEastAsia"/>
+                <w:b/>
+                <w:bCs/>
+                <w:color w:val="002060"/>
+                <w:sz w:val="20"/>
+                <w:szCs w:val="20"/>
+                <w:shd w:val="clear" w:color="auto" w:fill="auto"/>
+                <w:vertAlign w:val="baseline"/>
+              </w:rPr>
+              <w:t>I/O</w:t>
+            </w:r>
+          </w:p>
+        </w:tc>
+        <w:tc>
+          <w:tcPr>
+            <w:tcW w:w="840" w:type="dxa"/>
+            <w:tcBorders>
+              <w:tl2br w:val="nil"/>
+              <w:tr2bl w:val="nil"/>
+            </w:tcBorders>
+            <w:shd w:val="clear" w:color="auto" w:fill="A5A5A5" w:themeFill="accent3"/>
+            <w:vAlign w:val="center"/>
+          </w:tcPr>
+          <w:p>
+            <w:pPr>
+              <w:widowControl w:val="0"/>
+              <w:jc w:val="both"/>
+              <w:rPr>
+                <w:rFonts w:hint="default" w:asciiTheme="majorEastAsia" w:hAnsiTheme="majorEastAsia" w:eastAsiaTheme="majorEastAsia" w:cstheme="majorEastAsia"/>
+                <w:b/>
+                <w:bCs/>
+                <w:color w:val="002060"/>
+                <w:sz w:val="20"/>
+                <w:szCs w:val="20"/>
+                <w:shd w:val="clear" w:color="auto" w:fill="auto"/>
+                <w:vertAlign w:val="baseline"/>
+              </w:rPr>
+            </w:pPr>
+            <w:r>
+              <w:rPr>
+                <w:rFonts w:hint="default" w:asciiTheme="majorEastAsia" w:hAnsiTheme="majorEastAsia" w:eastAsiaTheme="majorEastAsia" w:cstheme="majorEastAsia"/>
+                <w:b/>
+                <w:bCs/>
+                <w:color w:val="002060"/>
+                <w:sz w:val="20"/>
+                <w:szCs w:val="20"/>
+                <w:shd w:val="clear" w:color="auto" w:fill="auto"/>
+                <w:vertAlign w:val="baseline"/>
+              </w:rPr>
+              <w:t>Clock</w:t>
+            </w:r>
+          </w:p>
+        </w:tc>
+        <w:tc>
+          <w:tcPr>
+            <w:tcW w:w="4455" w:type="dxa"/>
+            <w:tcBorders>
+              <w:tl2br w:val="nil"/>
+              <w:tr2bl w:val="nil"/>
+            </w:tcBorders>
+            <w:shd w:val="clear" w:color="auto" w:fill="A5A5A5" w:themeFill="accent3"/>
+            <w:vAlign w:val="center"/>
+          </w:tcPr>
+          <w:p>
+            <w:pPr>
+              <w:widowControl w:val="0"/>
+              <w:jc w:val="both"/>
+              <w:rPr>
+                <w:rFonts w:hint="default" w:asciiTheme="majorEastAsia" w:hAnsiTheme="majorEastAsia" w:eastAsiaTheme="majorEastAsia" w:cstheme="majorEastAsia"/>
+                <w:b/>
+                <w:bCs/>
+                <w:color w:val="002060"/>
+                <w:sz w:val="20"/>
+                <w:szCs w:val="20"/>
+                <w:shd w:val="clear" w:color="auto" w:fill="auto"/>
+                <w:vertAlign w:val="baseline"/>
+              </w:rPr>
+            </w:pPr>
+            <w:r>
+              <w:rPr>
+                <w:rFonts w:hint="default" w:asciiTheme="majorEastAsia" w:hAnsiTheme="majorEastAsia" w:eastAsiaTheme="majorEastAsia" w:cstheme="majorEastAsia"/>
+                <w:b/>
+                <w:bCs/>
+                <w:color w:val="002060"/>
+                <w:sz w:val="20"/>
+                <w:szCs w:val="20"/>
+                <w:shd w:val="clear" w:color="auto" w:fill="auto"/>
+                <w:vertAlign w:val="baseline"/>
+              </w:rPr>
+              <w:t>Detail</w:t>
+            </w:r>
+          </w:p>
+        </w:tc>
+      </w:tr>
+      <w:tr>
+        <w:tblPrEx>
+          <w:tblBorders>
+            <w:top w:val="single" w:color="auto" w:sz="4" w:space="0"/>
+            <w:left w:val="single" w:color="auto" w:sz="4" w:space="0"/>
+            <w:bottom w:val="single" w:color="auto" w:sz="4" w:space="0"/>
+            <w:right w:val="single" w:color="auto" w:sz="4" w:space="0"/>
+            <w:insideH w:val="single" w:color="auto" w:sz="4" w:space="0"/>
+            <w:insideV w:val="single" w:color="auto" w:sz="4" w:space="0"/>
+          </w:tblBorders>
+          <w:shd w:val="clear" w:color="auto" w:fill="auto"/>
+          <w:tblLayout w:type="fixed"/>
+          <w:tblCellMar>
+            <w:top w:w="0" w:type="dxa"/>
+            <w:left w:w="108" w:type="dxa"/>
+            <w:bottom w:w="0" w:type="dxa"/>
+            <w:right w:w="108" w:type="dxa"/>
+          </w:tblCellMar>
+        </w:tblPrEx>
+        <w:trPr>
+          <w:trHeight w:val="302" w:hRule="atLeast"/>
+        </w:trPr>
+        <w:tc>
+          <w:tcPr>
+            <w:tcW w:w="2319" w:type="dxa"/>
+            <w:tcBorders>
+              <w:tl2br w:val="nil"/>
+              <w:tr2bl w:val="nil"/>
+            </w:tcBorders>
+            <w:shd w:val="clear" w:color="auto" w:fill="FFFFFF" w:themeFill="background1"/>
+            <w:textDirection w:val="lrTbV"/>
+            <w:vAlign w:val="center"/>
+          </w:tcPr>
+          <w:p>
+            <w:pPr>
+              <w:widowControl w:val="0"/>
+              <w:jc w:val="both"/>
+              <w:rPr>
+                <w:rFonts w:hint="default" w:asciiTheme="majorEastAsia" w:hAnsiTheme="majorEastAsia" w:eastAsiaTheme="majorEastAsia" w:cstheme="majorEastAsia"/>
+                <w:b w:val="0"/>
+                <w:bCs w:val="0"/>
+                <w:color w:val="auto"/>
+                <w:sz w:val="20"/>
+                <w:szCs w:val="20"/>
+                <w:vertAlign w:val="baseline"/>
+              </w:rPr>
+            </w:pPr>
+            <w:r>
+              <w:rPr>
+                <w:rFonts w:hint="default" w:asciiTheme="majorEastAsia" w:hAnsiTheme="majorEastAsia" w:eastAsiaTheme="majorEastAsia" w:cstheme="majorEastAsia"/>
+                <w:b w:val="0"/>
+                <w:bCs w:val="0"/>
+                <w:color w:val="auto"/>
+                <w:sz w:val="20"/>
+                <w:szCs w:val="20"/>
+                <w:vertAlign w:val="baseline"/>
+              </w:rPr>
+              <w:t>rstn</w:t>
+            </w:r>
+          </w:p>
+        </w:tc>
+        <w:tc>
+          <w:tcPr>
+            <w:tcW w:w="840" w:type="dxa"/>
+            <w:tcBorders>
+              <w:tl2br w:val="nil"/>
+              <w:tr2bl w:val="nil"/>
+            </w:tcBorders>
+            <w:shd w:val="clear" w:color="auto" w:fill="FFFFFF" w:themeFill="background1"/>
+            <w:textDirection w:val="lrTbV"/>
+            <w:vAlign w:val="center"/>
+          </w:tcPr>
+          <w:p>
+            <w:pPr>
+              <w:widowControl w:val="0"/>
+              <w:jc w:val="both"/>
+              <w:rPr>
+                <w:rFonts w:hint="default" w:asciiTheme="majorEastAsia" w:hAnsiTheme="majorEastAsia" w:eastAsiaTheme="majorEastAsia" w:cstheme="majorEastAsia"/>
+                <w:b w:val="0"/>
+                <w:bCs w:val="0"/>
+                <w:color w:val="auto"/>
+                <w:sz w:val="20"/>
+                <w:szCs w:val="20"/>
+                <w:vertAlign w:val="baseline"/>
+              </w:rPr>
+            </w:pPr>
+            <w:r>
+              <w:rPr>
+                <w:rFonts w:hint="default" w:asciiTheme="majorEastAsia" w:hAnsiTheme="majorEastAsia" w:eastAsiaTheme="majorEastAsia" w:cstheme="majorEastAsia"/>
+                <w:b w:val="0"/>
+                <w:bCs w:val="0"/>
+                <w:color w:val="auto"/>
+                <w:sz w:val="20"/>
+                <w:szCs w:val="20"/>
+                <w:vertAlign w:val="baseline"/>
+              </w:rPr>
+              <w:t>Input</w:t>
+            </w:r>
+          </w:p>
+        </w:tc>
+        <w:tc>
+          <w:tcPr>
+            <w:tcW w:w="840" w:type="dxa"/>
+            <w:tcBorders>
+              <w:tl2br w:val="nil"/>
+              <w:tr2bl w:val="nil"/>
+            </w:tcBorders>
+            <w:shd w:val="clear" w:color="auto" w:fill="FFFFFF" w:themeFill="background1"/>
+            <w:textDirection w:val="lrTbV"/>
+            <w:vAlign w:val="center"/>
+          </w:tcPr>
+          <w:p>
+            <w:pPr>
+              <w:widowControl w:val="0"/>
+              <w:jc w:val="both"/>
+              <w:rPr>
+                <w:rFonts w:hint="default" w:asciiTheme="majorEastAsia" w:hAnsiTheme="majorEastAsia" w:eastAsiaTheme="majorEastAsia" w:cstheme="majorEastAsia"/>
+                <w:b w:val="0"/>
+                <w:bCs w:val="0"/>
+                <w:color w:val="auto"/>
+                <w:sz w:val="20"/>
+                <w:szCs w:val="20"/>
+                <w:vertAlign w:val="baseline"/>
+              </w:rPr>
+            </w:pPr>
+            <w:r>
+              <w:rPr>
+                <w:rFonts w:hint="default" w:asciiTheme="majorEastAsia" w:hAnsiTheme="majorEastAsia" w:eastAsiaTheme="majorEastAsia" w:cstheme="majorEastAsia"/>
+                <w:b w:val="0"/>
+                <w:bCs w:val="0"/>
+                <w:color w:val="auto"/>
+                <w:sz w:val="20"/>
+                <w:szCs w:val="20"/>
+                <w:vertAlign w:val="baseline"/>
+              </w:rPr>
+              <w:t>---------</w:t>
+            </w:r>
+          </w:p>
+        </w:tc>
+        <w:tc>
+          <w:tcPr>
+            <w:tcW w:w="4455" w:type="dxa"/>
+            <w:tcBorders>
+              <w:tl2br w:val="nil"/>
+              <w:tr2bl w:val="nil"/>
+            </w:tcBorders>
+            <w:shd w:val="clear" w:color="auto" w:fill="FFFFFF" w:themeFill="background1"/>
+            <w:textDirection w:val="lrTbV"/>
+            <w:vAlign w:val="center"/>
+          </w:tcPr>
+          <w:p>
+            <w:pPr>
+              <w:widowControl w:val="0"/>
+              <w:jc w:val="both"/>
+              <w:rPr>
+                <w:rFonts w:hint="default" w:asciiTheme="majorEastAsia" w:hAnsiTheme="majorEastAsia" w:eastAsiaTheme="majorEastAsia" w:cstheme="majorEastAsia"/>
+                <w:b w:val="0"/>
+                <w:bCs w:val="0"/>
+                <w:color w:val="auto"/>
+                <w:sz w:val="20"/>
+                <w:szCs w:val="20"/>
+                <w:vertAlign w:val="baseline"/>
+              </w:rPr>
+            </w:pPr>
+            <w:r>
+              <w:rPr>
+                <w:rFonts w:hint="default" w:asciiTheme="majorEastAsia" w:hAnsiTheme="majorEastAsia" w:eastAsiaTheme="majorEastAsia" w:cstheme="majorEastAsia"/>
+                <w:b w:val="0"/>
+                <w:bCs w:val="0"/>
+                <w:color w:val="auto"/>
+                <w:sz w:val="20"/>
+                <w:szCs w:val="20"/>
+                <w:vertAlign w:val="baseline"/>
+              </w:rPr>
+              <w:t>Asynchronous reset, active low</w:t>
+            </w:r>
+          </w:p>
+        </w:tc>
+      </w:tr>
+      <w:tr>
+        <w:tblPrEx>
+          <w:tblBorders>
+            <w:top w:val="single" w:color="auto" w:sz="4" w:space="0"/>
+            <w:left w:val="single" w:color="auto" w:sz="4" w:space="0"/>
+            <w:bottom w:val="single" w:color="auto" w:sz="4" w:space="0"/>
+            <w:right w:val="single" w:color="auto" w:sz="4" w:space="0"/>
+            <w:insideH w:val="single" w:color="auto" w:sz="4" w:space="0"/>
+            <w:insideV w:val="single" w:color="auto" w:sz="4" w:space="0"/>
+          </w:tblBorders>
+          <w:shd w:val="clear" w:color="auto" w:fill="auto"/>
+          <w:tblLayout w:type="fixed"/>
+          <w:tblCellMar>
+            <w:top w:w="0" w:type="dxa"/>
+            <w:left w:w="108" w:type="dxa"/>
+            <w:bottom w:w="0" w:type="dxa"/>
+            <w:right w:w="108" w:type="dxa"/>
+          </w:tblCellMar>
+        </w:tblPrEx>
+        <w:trPr>
+          <w:trHeight w:val="302" w:hRule="atLeast"/>
+        </w:trPr>
+        <w:tc>
+          <w:tcPr>
+            <w:tcW w:w="2319" w:type="dxa"/>
+            <w:tcBorders>
+              <w:tl2br w:val="nil"/>
+              <w:tr2bl w:val="nil"/>
+            </w:tcBorders>
+            <w:shd w:val="clear" w:color="auto" w:fill="FFFFFF" w:themeFill="background1"/>
+            <w:textDirection w:val="lrTbV"/>
+            <w:vAlign w:val="center"/>
+          </w:tcPr>
+          <w:p>
+            <w:pPr>
+              <w:widowControl w:val="0"/>
+              <w:jc w:val="both"/>
+              <w:rPr>
+                <w:rFonts w:hint="default" w:asciiTheme="majorEastAsia" w:hAnsiTheme="majorEastAsia" w:eastAsiaTheme="majorEastAsia" w:cstheme="majorEastAsia"/>
+                <w:b w:val="0"/>
+                <w:bCs w:val="0"/>
+                <w:color w:val="auto"/>
+                <w:sz w:val="20"/>
+                <w:szCs w:val="20"/>
+                <w:vertAlign w:val="baseline"/>
+              </w:rPr>
+            </w:pPr>
+            <w:r>
+              <w:rPr>
+                <w:rFonts w:hint="default" w:asciiTheme="majorEastAsia" w:hAnsiTheme="majorEastAsia" w:eastAsiaTheme="majorEastAsia" w:cstheme="majorEastAsia"/>
+                <w:b w:val="0"/>
+                <w:bCs w:val="0"/>
+                <w:color w:val="auto"/>
+                <w:sz w:val="20"/>
+                <w:szCs w:val="20"/>
+                <w:vertAlign w:val="baseline"/>
+              </w:rPr>
+              <w:t>clk</w:t>
+            </w:r>
+          </w:p>
+        </w:tc>
+        <w:tc>
+          <w:tcPr>
+            <w:tcW w:w="840" w:type="dxa"/>
+            <w:tcBorders>
+              <w:tl2br w:val="nil"/>
+              <w:tr2bl w:val="nil"/>
+            </w:tcBorders>
+            <w:shd w:val="clear" w:color="auto" w:fill="FFFFFF" w:themeFill="background1"/>
+            <w:textDirection w:val="lrTbV"/>
+            <w:vAlign w:val="center"/>
+          </w:tcPr>
+          <w:p>
+            <w:pPr>
+              <w:widowControl w:val="0"/>
+              <w:jc w:val="both"/>
+              <w:rPr>
+                <w:rFonts w:hint="default" w:asciiTheme="majorEastAsia" w:hAnsiTheme="majorEastAsia" w:eastAsiaTheme="majorEastAsia" w:cstheme="majorEastAsia"/>
+                <w:b w:val="0"/>
+                <w:bCs w:val="0"/>
+                <w:color w:val="auto"/>
+                <w:sz w:val="20"/>
+                <w:szCs w:val="20"/>
+                <w:vertAlign w:val="baseline"/>
+              </w:rPr>
+            </w:pPr>
+            <w:r>
+              <w:rPr>
+                <w:rFonts w:hint="default" w:asciiTheme="majorEastAsia" w:hAnsiTheme="majorEastAsia" w:eastAsiaTheme="majorEastAsia" w:cstheme="majorEastAsia"/>
+                <w:b w:val="0"/>
+                <w:bCs w:val="0"/>
+                <w:color w:val="auto"/>
+                <w:sz w:val="20"/>
+                <w:szCs w:val="20"/>
+                <w:vertAlign w:val="baseline"/>
+              </w:rPr>
+              <w:t>Input</w:t>
+            </w:r>
+          </w:p>
+        </w:tc>
+        <w:tc>
+          <w:tcPr>
+            <w:tcW w:w="840" w:type="dxa"/>
+            <w:tcBorders>
+              <w:tl2br w:val="nil"/>
+              <w:tr2bl w:val="nil"/>
+            </w:tcBorders>
+            <w:shd w:val="clear" w:color="auto" w:fill="FFFFFF" w:themeFill="background1"/>
+            <w:textDirection w:val="lrTbV"/>
+            <w:vAlign w:val="center"/>
+          </w:tcPr>
+          <w:p>
+            <w:pPr>
+              <w:widowControl w:val="0"/>
+              <w:jc w:val="both"/>
+              <w:rPr>
+                <w:rFonts w:hint="default" w:asciiTheme="majorEastAsia" w:hAnsiTheme="majorEastAsia" w:eastAsiaTheme="majorEastAsia" w:cstheme="majorEastAsia"/>
+                <w:b w:val="0"/>
+                <w:bCs w:val="0"/>
+                <w:color w:val="auto"/>
+                <w:sz w:val="20"/>
+                <w:szCs w:val="20"/>
+                <w:vertAlign w:val="baseline"/>
+              </w:rPr>
+            </w:pPr>
+            <w:r>
+              <w:rPr>
+                <w:rFonts w:hint="default" w:asciiTheme="majorEastAsia" w:hAnsiTheme="majorEastAsia" w:eastAsiaTheme="majorEastAsia" w:cstheme="majorEastAsia"/>
+                <w:b w:val="0"/>
+                <w:bCs w:val="0"/>
+                <w:color w:val="auto"/>
+                <w:sz w:val="20"/>
+                <w:szCs w:val="20"/>
+                <w:vertAlign w:val="baseline"/>
+              </w:rPr>
+              <w:t>---------</w:t>
+            </w:r>
+          </w:p>
+        </w:tc>
+        <w:tc>
+          <w:tcPr>
+            <w:tcW w:w="4455" w:type="dxa"/>
+            <w:tcBorders>
+              <w:tl2br w:val="nil"/>
+              <w:tr2bl w:val="nil"/>
+            </w:tcBorders>
+            <w:shd w:val="clear" w:color="auto" w:fill="FFFFFF" w:themeFill="background1"/>
+            <w:textDirection w:val="lrTbV"/>
+            <w:vAlign w:val="center"/>
+          </w:tcPr>
+          <w:p>
+            <w:pPr>
+              <w:widowControl w:val="0"/>
+              <w:jc w:val="both"/>
+              <w:rPr>
+                <w:rFonts w:hint="default" w:asciiTheme="majorEastAsia" w:hAnsiTheme="majorEastAsia" w:eastAsiaTheme="majorEastAsia" w:cstheme="majorEastAsia"/>
+                <w:b w:val="0"/>
+                <w:bCs w:val="0"/>
+                <w:color w:val="auto"/>
+                <w:sz w:val="20"/>
+                <w:szCs w:val="20"/>
+                <w:vertAlign w:val="baseline"/>
+              </w:rPr>
+            </w:pPr>
+            <w:r>
+              <w:rPr>
+                <w:rFonts w:hint="default" w:asciiTheme="majorEastAsia" w:hAnsiTheme="majorEastAsia" w:eastAsiaTheme="majorEastAsia" w:cstheme="majorEastAsia"/>
+                <w:b w:val="0"/>
+                <w:bCs w:val="0"/>
+                <w:color w:val="auto"/>
+                <w:sz w:val="20"/>
+                <w:szCs w:val="20"/>
+                <w:vertAlign w:val="baseline"/>
+              </w:rPr>
+              <w:t>MCU clock - 500MHz</w:t>
+            </w:r>
+          </w:p>
+        </w:tc>
+      </w:tr>
+      <w:tr>
+        <w:tblPrEx>
+          <w:tblBorders>
+            <w:top w:val="single" w:color="auto" w:sz="4" w:space="0"/>
+            <w:left w:val="single" w:color="auto" w:sz="4" w:space="0"/>
+            <w:bottom w:val="single" w:color="auto" w:sz="4" w:space="0"/>
+            <w:right w:val="single" w:color="auto" w:sz="4" w:space="0"/>
+            <w:insideH w:val="single" w:color="auto" w:sz="4" w:space="0"/>
+            <w:insideV w:val="single" w:color="auto" w:sz="4" w:space="0"/>
+          </w:tblBorders>
+          <w:shd w:val="clear" w:color="auto" w:fill="auto"/>
+          <w:tblLayout w:type="fixed"/>
+          <w:tblCellMar>
+            <w:top w:w="0" w:type="dxa"/>
+            <w:left w:w="108" w:type="dxa"/>
+            <w:bottom w:w="0" w:type="dxa"/>
+            <w:right w:w="108" w:type="dxa"/>
+          </w:tblCellMar>
+        </w:tblPrEx>
+        <w:trPr>
+          <w:trHeight w:val="302" w:hRule="atLeast"/>
+        </w:trPr>
+        <w:tc>
+          <w:tcPr>
+            <w:tcW w:w="8454" w:type="dxa"/>
+            <w:gridSpan w:val="4"/>
+            <w:tcBorders>
+              <w:tl2br w:val="nil"/>
+              <w:tr2bl w:val="nil"/>
+            </w:tcBorders>
+            <w:shd w:val="clear" w:color="auto" w:fill="FFFFFF" w:themeFill="background1"/>
+            <w:textDirection w:val="lrTbV"/>
+            <w:vAlign w:val="center"/>
+          </w:tcPr>
+          <w:p>
+            <w:pPr>
+              <w:widowControl w:val="0"/>
+              <w:jc w:val="both"/>
+              <w:rPr>
+                <w:rFonts w:hint="eastAsia" w:asciiTheme="majorEastAsia" w:hAnsiTheme="majorEastAsia" w:eastAsiaTheme="majorEastAsia" w:cstheme="majorEastAsia"/>
+                <w:b/>
+                <w:bCs/>
+                <w:color w:val="auto"/>
+                <w:sz w:val="20"/>
+                <w:szCs w:val="20"/>
+                <w:vertAlign w:val="baseline"/>
+              </w:rPr>
+            </w:pPr>
+            <w:r>
+              <w:rPr>
+                <w:rFonts w:hint="default" w:asciiTheme="majorEastAsia" w:hAnsiTheme="majorEastAsia" w:eastAsiaTheme="majorEastAsia" w:cstheme="majorEastAsia"/>
+                <w:b/>
+                <w:bCs/>
+                <w:color w:val="auto"/>
+                <w:sz w:val="20"/>
+                <w:szCs w:val="20"/>
+                <w:vertAlign w:val="baseline"/>
+              </w:rPr>
+              <w:t xml:space="preserve">(from) AHB Master side </w:t>
+            </w:r>
+            <w:r>
+              <w:rPr>
+                <w:rFonts w:hint="default" w:asciiTheme="majorEastAsia" w:hAnsiTheme="majorEastAsia" w:eastAsiaTheme="majorEastAsia" w:cstheme="majorEastAsia"/>
+                <w:b/>
+                <w:bCs/>
+                <w:color w:val="auto"/>
+                <w:sz w:val="20"/>
+                <w:szCs w:val="20"/>
+                <w:vertAlign w:val="baseline"/>
+              </w:rPr>
+              <w:t>--------------------------------------------------------------------------------------</w:t>
+            </w:r>
+          </w:p>
+        </w:tc>
+      </w:tr>
+      <w:tr>
+        <w:tblPrEx>
+          <w:tblBorders>
+            <w:top w:val="single" w:color="auto" w:sz="4" w:space="0"/>
+            <w:left w:val="single" w:color="auto" w:sz="4" w:space="0"/>
+            <w:bottom w:val="single" w:color="auto" w:sz="4" w:space="0"/>
+            <w:right w:val="single" w:color="auto" w:sz="4" w:space="0"/>
+            <w:insideH w:val="single" w:color="auto" w:sz="4" w:space="0"/>
+            <w:insideV w:val="single" w:color="auto" w:sz="4" w:space="0"/>
+          </w:tblBorders>
+          <w:shd w:val="clear" w:color="auto" w:fill="auto"/>
+          <w:tblLayout w:type="fixed"/>
+          <w:tblCellMar>
+            <w:top w:w="0" w:type="dxa"/>
+            <w:left w:w="108" w:type="dxa"/>
+            <w:bottom w:w="0" w:type="dxa"/>
+            <w:right w:w="108" w:type="dxa"/>
+          </w:tblCellMar>
+        </w:tblPrEx>
+        <w:trPr>
+          <w:trHeight w:val="302" w:hRule="atLeast"/>
+        </w:trPr>
+        <w:tc>
+          <w:tcPr>
+            <w:tcW w:w="2319" w:type="dxa"/>
+            <w:tcBorders>
+              <w:tl2br w:val="nil"/>
+              <w:tr2bl w:val="nil"/>
+            </w:tcBorders>
+            <w:shd w:val="clear" w:color="auto" w:fill="auto"/>
+            <w:vAlign w:val="top"/>
+          </w:tcPr>
+          <w:p>
+            <w:pPr>
+              <w:widowControl w:val="0"/>
+              <w:jc w:val="left"/>
+              <w:rPr>
+                <w:rFonts w:hint="eastAsia" w:asciiTheme="majorEastAsia" w:hAnsiTheme="majorEastAsia" w:eastAsiaTheme="majorEastAsia" w:cstheme="majorEastAsia"/>
+                <w:b w:val="0"/>
+                <w:bCs w:val="0"/>
+                <w:color w:val="auto"/>
+                <w:sz w:val="20"/>
+                <w:szCs w:val="20"/>
+                <w:vertAlign w:val="baseline"/>
+              </w:rPr>
+            </w:pPr>
+          </w:p>
+        </w:tc>
+        <w:tc>
+          <w:tcPr>
+            <w:tcW w:w="840" w:type="dxa"/>
+            <w:tcBorders>
+              <w:tl2br w:val="nil"/>
+              <w:tr2bl w:val="nil"/>
+            </w:tcBorders>
+            <w:shd w:val="clear" w:color="auto" w:fill="auto"/>
+            <w:vAlign w:val="top"/>
+          </w:tcPr>
+          <w:p>
+            <w:pPr>
+              <w:widowControl w:val="0"/>
+              <w:jc w:val="left"/>
+              <w:rPr>
+                <w:rFonts w:hint="eastAsia" w:asciiTheme="majorEastAsia" w:hAnsiTheme="majorEastAsia" w:eastAsiaTheme="majorEastAsia" w:cstheme="majorEastAsia"/>
+                <w:b w:val="0"/>
+                <w:bCs w:val="0"/>
+                <w:color w:val="auto"/>
+                <w:sz w:val="20"/>
+                <w:szCs w:val="20"/>
+                <w:vertAlign w:val="baseline"/>
+              </w:rPr>
+            </w:pPr>
+            <w:r>
+              <w:rPr>
+                <w:rFonts w:hint="default" w:asciiTheme="majorEastAsia" w:hAnsiTheme="majorEastAsia" w:eastAsiaTheme="majorEastAsia" w:cstheme="majorEastAsia"/>
+                <w:b w:val="0"/>
+                <w:bCs w:val="0"/>
+                <w:color w:val="auto"/>
+                <w:sz w:val="20"/>
+                <w:szCs w:val="20"/>
+                <w:vertAlign w:val="baseline"/>
+              </w:rPr>
+              <w:t>Input</w:t>
+            </w:r>
+          </w:p>
+        </w:tc>
+        <w:tc>
+          <w:tcPr>
+            <w:tcW w:w="840" w:type="dxa"/>
+            <w:tcBorders>
+              <w:tl2br w:val="nil"/>
+              <w:tr2bl w:val="nil"/>
+            </w:tcBorders>
+            <w:shd w:val="clear" w:color="auto" w:fill="auto"/>
+            <w:vAlign w:val="top"/>
+          </w:tcPr>
+          <w:p>
+            <w:pPr>
+              <w:widowControl w:val="0"/>
+              <w:jc w:val="left"/>
+              <w:rPr>
+                <w:rFonts w:hint="eastAsia" w:asciiTheme="majorEastAsia" w:hAnsiTheme="majorEastAsia" w:eastAsiaTheme="majorEastAsia" w:cstheme="majorEastAsia"/>
+                <w:b w:val="0"/>
+                <w:bCs w:val="0"/>
+                <w:color w:val="auto"/>
+                <w:sz w:val="20"/>
+                <w:szCs w:val="20"/>
+                <w:vertAlign w:val="baseline"/>
+              </w:rPr>
+            </w:pPr>
+          </w:p>
+        </w:tc>
+        <w:tc>
+          <w:tcPr>
+            <w:tcW w:w="4455" w:type="dxa"/>
+            <w:tcBorders>
+              <w:tl2br w:val="nil"/>
+              <w:tr2bl w:val="nil"/>
+            </w:tcBorders>
+            <w:shd w:val="clear" w:color="auto" w:fill="auto"/>
+            <w:vAlign w:val="top"/>
+          </w:tcPr>
+          <w:p>
+            <w:pPr>
+              <w:widowControl w:val="0"/>
+              <w:jc w:val="left"/>
+              <w:rPr>
+                <w:rFonts w:hint="eastAsia" w:asciiTheme="majorEastAsia" w:hAnsiTheme="majorEastAsia" w:eastAsiaTheme="majorEastAsia" w:cstheme="majorEastAsia"/>
+                <w:b w:val="0"/>
+                <w:bCs w:val="0"/>
+                <w:color w:val="auto"/>
+                <w:sz w:val="20"/>
+                <w:szCs w:val="20"/>
+                <w:vertAlign w:val="baseline"/>
+              </w:rPr>
+            </w:pPr>
+          </w:p>
+        </w:tc>
+      </w:tr>
+      <w:tr>
+        <w:tblPrEx>
+          <w:tblBorders>
+            <w:top w:val="single" w:color="auto" w:sz="4" w:space="0"/>
+            <w:left w:val="single" w:color="auto" w:sz="4" w:space="0"/>
+            <w:bottom w:val="single" w:color="auto" w:sz="4" w:space="0"/>
+            <w:right w:val="single" w:color="auto" w:sz="4" w:space="0"/>
+            <w:insideH w:val="single" w:color="auto" w:sz="4" w:space="0"/>
+            <w:insideV w:val="single" w:color="auto" w:sz="4" w:space="0"/>
+          </w:tblBorders>
+          <w:shd w:val="clear" w:color="auto" w:fill="auto"/>
+          <w:tblLayout w:type="fixed"/>
+          <w:tblCellMar>
+            <w:top w:w="0" w:type="dxa"/>
+            <w:left w:w="108" w:type="dxa"/>
+            <w:bottom w:w="0" w:type="dxa"/>
+            <w:right w:w="108" w:type="dxa"/>
+          </w:tblCellMar>
+        </w:tblPrEx>
+        <w:trPr>
+          <w:trHeight w:val="302" w:hRule="atLeast"/>
+        </w:trPr>
+        <w:tc>
+          <w:tcPr>
+            <w:tcW w:w="2319" w:type="dxa"/>
+            <w:tcBorders>
+              <w:tl2br w:val="nil"/>
+              <w:tr2bl w:val="nil"/>
+            </w:tcBorders>
+            <w:shd w:val="clear" w:color="auto" w:fill="auto"/>
+            <w:vAlign w:val="top"/>
+          </w:tcPr>
+          <w:p>
+            <w:pPr>
+              <w:widowControl w:val="0"/>
+              <w:jc w:val="left"/>
+              <w:rPr>
+                <w:rFonts w:hint="eastAsia" w:asciiTheme="majorEastAsia" w:hAnsiTheme="majorEastAsia" w:eastAsiaTheme="majorEastAsia" w:cstheme="majorEastAsia"/>
+                <w:b w:val="0"/>
+                <w:bCs w:val="0"/>
+                <w:color w:val="auto"/>
+                <w:sz w:val="20"/>
+                <w:szCs w:val="20"/>
+                <w:vertAlign w:val="baseline"/>
+              </w:rPr>
+            </w:pPr>
+          </w:p>
+        </w:tc>
+        <w:tc>
+          <w:tcPr>
+            <w:tcW w:w="840" w:type="dxa"/>
+            <w:tcBorders>
+              <w:tl2br w:val="nil"/>
+              <w:tr2bl w:val="nil"/>
+            </w:tcBorders>
+            <w:shd w:val="clear" w:color="auto" w:fill="auto"/>
+            <w:vAlign w:val="top"/>
+          </w:tcPr>
+          <w:p>
+            <w:pPr>
+              <w:widowControl w:val="0"/>
+              <w:jc w:val="left"/>
+              <w:rPr>
+                <w:rFonts w:hint="default" w:asciiTheme="majorEastAsia" w:hAnsiTheme="majorEastAsia" w:eastAsiaTheme="majorEastAsia" w:cstheme="majorEastAsia"/>
+                <w:b w:val="0"/>
+                <w:bCs w:val="0"/>
+                <w:color w:val="auto"/>
+                <w:sz w:val="20"/>
+                <w:szCs w:val="20"/>
+                <w:vertAlign w:val="baseline"/>
+              </w:rPr>
+            </w:pPr>
+            <w:r>
+              <w:rPr>
+                <w:rFonts w:hint="default" w:asciiTheme="majorEastAsia" w:hAnsiTheme="majorEastAsia" w:eastAsiaTheme="majorEastAsia" w:cstheme="majorEastAsia"/>
+                <w:b w:val="0"/>
+                <w:bCs w:val="0"/>
+                <w:color w:val="auto"/>
+                <w:sz w:val="20"/>
+                <w:szCs w:val="20"/>
+                <w:vertAlign w:val="baseline"/>
+              </w:rPr>
+              <w:t>Ouput</w:t>
+            </w:r>
+          </w:p>
+        </w:tc>
+        <w:tc>
+          <w:tcPr>
+            <w:tcW w:w="840" w:type="dxa"/>
+            <w:tcBorders>
+              <w:tl2br w:val="nil"/>
+              <w:tr2bl w:val="nil"/>
+            </w:tcBorders>
+            <w:shd w:val="clear" w:color="auto" w:fill="auto"/>
+            <w:vAlign w:val="top"/>
+          </w:tcPr>
+          <w:p>
+            <w:pPr>
+              <w:widowControl w:val="0"/>
+              <w:jc w:val="left"/>
+              <w:rPr>
+                <w:rFonts w:hint="eastAsia" w:asciiTheme="majorEastAsia" w:hAnsiTheme="majorEastAsia" w:eastAsiaTheme="majorEastAsia" w:cstheme="majorEastAsia"/>
+                <w:b w:val="0"/>
+                <w:bCs w:val="0"/>
+                <w:color w:val="auto"/>
+                <w:sz w:val="20"/>
+                <w:szCs w:val="20"/>
+                <w:vertAlign w:val="baseline"/>
+              </w:rPr>
+            </w:pPr>
+          </w:p>
+        </w:tc>
+        <w:tc>
+          <w:tcPr>
+            <w:tcW w:w="4455" w:type="dxa"/>
+            <w:tcBorders>
+              <w:tl2br w:val="nil"/>
+              <w:tr2bl w:val="nil"/>
+            </w:tcBorders>
+            <w:shd w:val="clear" w:color="auto" w:fill="auto"/>
+            <w:vAlign w:val="top"/>
+          </w:tcPr>
+          <w:p>
+            <w:pPr>
+              <w:widowControl w:val="0"/>
+              <w:jc w:val="left"/>
+              <w:rPr>
+                <w:rFonts w:hint="eastAsia" w:asciiTheme="majorEastAsia" w:hAnsiTheme="majorEastAsia" w:eastAsiaTheme="majorEastAsia" w:cstheme="majorEastAsia"/>
+                <w:b w:val="0"/>
+                <w:bCs w:val="0"/>
+                <w:color w:val="auto"/>
+                <w:sz w:val="20"/>
+                <w:szCs w:val="20"/>
+                <w:vertAlign w:val="baseline"/>
+              </w:rPr>
+            </w:pPr>
+          </w:p>
+        </w:tc>
+      </w:tr>
+      <w:tr>
+        <w:tblPrEx>
+          <w:tblBorders>
+            <w:top w:val="single" w:color="auto" w:sz="4" w:space="0"/>
+            <w:left w:val="single" w:color="auto" w:sz="4" w:space="0"/>
+            <w:bottom w:val="single" w:color="auto" w:sz="4" w:space="0"/>
+            <w:right w:val="single" w:color="auto" w:sz="4" w:space="0"/>
+            <w:insideH w:val="single" w:color="auto" w:sz="4" w:space="0"/>
+            <w:insideV w:val="single" w:color="auto" w:sz="4" w:space="0"/>
+          </w:tblBorders>
+          <w:shd w:val="clear" w:color="auto" w:fill="auto"/>
+          <w:tblLayout w:type="fixed"/>
+          <w:tblCellMar>
+            <w:top w:w="0" w:type="dxa"/>
+            <w:left w:w="108" w:type="dxa"/>
+            <w:bottom w:w="0" w:type="dxa"/>
+            <w:right w:w="108" w:type="dxa"/>
+          </w:tblCellMar>
+        </w:tblPrEx>
+        <w:trPr>
+          <w:trHeight w:val="302" w:hRule="atLeast"/>
+        </w:trPr>
+        <w:tc>
+          <w:tcPr>
+            <w:tcW w:w="8454" w:type="dxa"/>
+            <w:gridSpan w:val="4"/>
+            <w:tcBorders>
+              <w:tl2br w:val="nil"/>
+              <w:tr2bl w:val="nil"/>
+            </w:tcBorders>
+            <w:shd w:val="clear" w:color="auto" w:fill="auto"/>
+            <w:textDirection w:val="lrTbV"/>
+            <w:vAlign w:val="center"/>
+          </w:tcPr>
+          <w:p>
+            <w:pPr>
+              <w:widowControl w:val="0"/>
+              <w:jc w:val="both"/>
+              <w:rPr>
+                <w:rFonts w:hint="eastAsia" w:asciiTheme="majorEastAsia" w:hAnsiTheme="majorEastAsia" w:eastAsiaTheme="majorEastAsia" w:cstheme="majorEastAsia"/>
+                <w:b w:val="0"/>
+                <w:bCs w:val="0"/>
+                <w:color w:val="auto"/>
+                <w:sz w:val="20"/>
+                <w:szCs w:val="20"/>
+                <w:vertAlign w:val="baseline"/>
+              </w:rPr>
+            </w:pPr>
+            <w:r>
+              <w:rPr>
+                <w:rFonts w:hint="default" w:asciiTheme="majorEastAsia" w:hAnsiTheme="majorEastAsia" w:eastAsiaTheme="majorEastAsia" w:cstheme="majorEastAsia"/>
+                <w:b/>
+                <w:bCs/>
+                <w:color w:val="auto"/>
+                <w:sz w:val="20"/>
+                <w:szCs w:val="20"/>
+                <w:vertAlign w:val="baseline"/>
+              </w:rPr>
+              <w:t>UART interface --------------------------------------------------------------------------------------------------</w:t>
+            </w:r>
+          </w:p>
+        </w:tc>
+      </w:tr>
+      <w:tr>
+        <w:tblPrEx>
+          <w:tblBorders>
+            <w:top w:val="single" w:color="auto" w:sz="4" w:space="0"/>
+            <w:left w:val="single" w:color="auto" w:sz="4" w:space="0"/>
+            <w:bottom w:val="single" w:color="auto" w:sz="4" w:space="0"/>
+            <w:right w:val="single" w:color="auto" w:sz="4" w:space="0"/>
+            <w:insideH w:val="single" w:color="auto" w:sz="4" w:space="0"/>
+            <w:insideV w:val="single" w:color="auto" w:sz="4" w:space="0"/>
+          </w:tblBorders>
+          <w:shd w:val="clear" w:color="auto" w:fill="auto"/>
+          <w:tblLayout w:type="fixed"/>
+          <w:tblCellMar>
+            <w:top w:w="0" w:type="dxa"/>
+            <w:left w:w="108" w:type="dxa"/>
+            <w:bottom w:w="0" w:type="dxa"/>
+            <w:right w:w="108" w:type="dxa"/>
+          </w:tblCellMar>
+        </w:tblPrEx>
+        <w:trPr>
+          <w:trHeight w:val="302" w:hRule="atLeast"/>
+        </w:trPr>
+        <w:tc>
+          <w:tcPr>
+            <w:tcW w:w="2319" w:type="dxa"/>
+            <w:tcBorders>
+              <w:tl2br w:val="nil"/>
+              <w:tr2bl w:val="nil"/>
+            </w:tcBorders>
+            <w:shd w:val="clear" w:color="auto" w:fill="auto"/>
+            <w:vAlign w:val="top"/>
+          </w:tcPr>
+          <w:p>
+            <w:pPr>
+              <w:widowControl w:val="0"/>
+              <w:jc w:val="left"/>
+              <w:rPr>
+                <w:rFonts w:hint="eastAsia" w:asciiTheme="majorEastAsia" w:hAnsiTheme="majorEastAsia" w:eastAsiaTheme="majorEastAsia" w:cstheme="majorEastAsia"/>
+                <w:b w:val="0"/>
+                <w:bCs w:val="0"/>
+                <w:color w:val="auto"/>
+                <w:sz w:val="20"/>
+                <w:szCs w:val="20"/>
+                <w:vertAlign w:val="baseline"/>
+              </w:rPr>
+            </w:pPr>
+          </w:p>
+        </w:tc>
+        <w:tc>
+          <w:tcPr>
+            <w:tcW w:w="840" w:type="dxa"/>
+            <w:tcBorders>
+              <w:tl2br w:val="nil"/>
+              <w:tr2bl w:val="nil"/>
+            </w:tcBorders>
+            <w:shd w:val="clear" w:color="auto" w:fill="auto"/>
+            <w:vAlign w:val="top"/>
+          </w:tcPr>
+          <w:p>
+            <w:pPr>
+              <w:widowControl w:val="0"/>
+              <w:jc w:val="left"/>
+              <w:rPr>
+                <w:rFonts w:hint="default" w:asciiTheme="majorEastAsia" w:hAnsiTheme="majorEastAsia" w:eastAsiaTheme="majorEastAsia" w:cstheme="majorEastAsia"/>
+                <w:b w:val="0"/>
+                <w:bCs w:val="0"/>
+                <w:color w:val="auto"/>
+                <w:sz w:val="20"/>
+                <w:szCs w:val="20"/>
+                <w:vertAlign w:val="baseline"/>
+              </w:rPr>
+            </w:pPr>
+            <w:r>
+              <w:rPr>
+                <w:rFonts w:hint="default" w:asciiTheme="majorEastAsia" w:hAnsiTheme="majorEastAsia" w:eastAsiaTheme="majorEastAsia" w:cstheme="majorEastAsia"/>
+                <w:b w:val="0"/>
+                <w:bCs w:val="0"/>
+                <w:color w:val="auto"/>
+                <w:sz w:val="20"/>
+                <w:szCs w:val="20"/>
+                <w:vertAlign w:val="baseline"/>
+              </w:rPr>
+              <w:t>Input</w:t>
+            </w:r>
+          </w:p>
+        </w:tc>
+        <w:tc>
+          <w:tcPr>
+            <w:tcW w:w="840" w:type="dxa"/>
+            <w:tcBorders>
+              <w:tl2br w:val="nil"/>
+              <w:tr2bl w:val="nil"/>
+            </w:tcBorders>
+            <w:shd w:val="clear" w:color="auto" w:fill="auto"/>
+            <w:vAlign w:val="top"/>
+          </w:tcPr>
+          <w:p>
+            <w:pPr>
+              <w:widowControl w:val="0"/>
+              <w:jc w:val="left"/>
+              <w:rPr>
+                <w:rFonts w:hint="eastAsia" w:asciiTheme="majorEastAsia" w:hAnsiTheme="majorEastAsia" w:eastAsiaTheme="majorEastAsia" w:cstheme="majorEastAsia"/>
+                <w:b w:val="0"/>
+                <w:bCs w:val="0"/>
+                <w:color w:val="auto"/>
+                <w:sz w:val="20"/>
+                <w:szCs w:val="20"/>
+                <w:vertAlign w:val="baseline"/>
+              </w:rPr>
+            </w:pPr>
+          </w:p>
+        </w:tc>
+        <w:tc>
+          <w:tcPr>
+            <w:tcW w:w="4455" w:type="dxa"/>
+            <w:tcBorders>
+              <w:tl2br w:val="nil"/>
+              <w:tr2bl w:val="nil"/>
+            </w:tcBorders>
+            <w:shd w:val="clear" w:color="auto" w:fill="auto"/>
+            <w:vAlign w:val="top"/>
+          </w:tcPr>
+          <w:p>
+            <w:pPr>
+              <w:widowControl w:val="0"/>
+              <w:jc w:val="left"/>
+              <w:rPr>
+                <w:rFonts w:hint="eastAsia" w:asciiTheme="majorEastAsia" w:hAnsiTheme="majorEastAsia" w:eastAsiaTheme="majorEastAsia" w:cstheme="majorEastAsia"/>
+                <w:b w:val="0"/>
+                <w:bCs w:val="0"/>
+                <w:color w:val="auto"/>
+                <w:sz w:val="20"/>
+                <w:szCs w:val="20"/>
+                <w:vertAlign w:val="baseline"/>
+              </w:rPr>
+            </w:pPr>
+          </w:p>
+        </w:tc>
+      </w:tr>
+      <w:tr>
+        <w:tblPrEx>
+          <w:tblBorders>
+            <w:top w:val="single" w:color="auto" w:sz="4" w:space="0"/>
+            <w:left w:val="single" w:color="auto" w:sz="4" w:space="0"/>
+            <w:bottom w:val="single" w:color="auto" w:sz="4" w:space="0"/>
+            <w:right w:val="single" w:color="auto" w:sz="4" w:space="0"/>
+            <w:insideH w:val="single" w:color="auto" w:sz="4" w:space="0"/>
+            <w:insideV w:val="single" w:color="auto" w:sz="4" w:space="0"/>
+          </w:tblBorders>
+          <w:shd w:val="clear" w:color="auto" w:fill="auto"/>
+          <w:tblLayout w:type="fixed"/>
+          <w:tblCellMar>
+            <w:top w:w="0" w:type="dxa"/>
+            <w:left w:w="108" w:type="dxa"/>
+            <w:bottom w:w="0" w:type="dxa"/>
+            <w:right w:w="108" w:type="dxa"/>
+          </w:tblCellMar>
+        </w:tblPrEx>
+        <w:trPr>
+          <w:trHeight w:val="302" w:hRule="atLeast"/>
+        </w:trPr>
+        <w:tc>
+          <w:tcPr>
+            <w:tcW w:w="2319" w:type="dxa"/>
+            <w:tcBorders>
+              <w:tl2br w:val="nil"/>
+              <w:tr2bl w:val="nil"/>
+            </w:tcBorders>
+            <w:shd w:val="clear" w:color="auto" w:fill="auto"/>
+            <w:vAlign w:val="top"/>
+          </w:tcPr>
+          <w:p>
+            <w:pPr>
+              <w:widowControl w:val="0"/>
+              <w:jc w:val="left"/>
+              <w:rPr>
+                <w:rFonts w:hint="eastAsia" w:asciiTheme="majorEastAsia" w:hAnsiTheme="majorEastAsia" w:eastAsiaTheme="majorEastAsia" w:cstheme="majorEastAsia"/>
+                <w:b w:val="0"/>
+                <w:bCs w:val="0"/>
+                <w:color w:val="auto"/>
+                <w:sz w:val="20"/>
+                <w:szCs w:val="20"/>
+                <w:vertAlign w:val="baseline"/>
+              </w:rPr>
+            </w:pPr>
+          </w:p>
+        </w:tc>
+        <w:tc>
+          <w:tcPr>
+            <w:tcW w:w="840" w:type="dxa"/>
+            <w:tcBorders>
+              <w:tl2br w:val="nil"/>
+              <w:tr2bl w:val="nil"/>
+            </w:tcBorders>
+            <w:shd w:val="clear" w:color="auto" w:fill="auto"/>
+            <w:vAlign w:val="top"/>
+          </w:tcPr>
+          <w:p>
+            <w:pPr>
+              <w:widowControl w:val="0"/>
+              <w:jc w:val="left"/>
+              <w:rPr>
+                <w:rFonts w:hint="default" w:asciiTheme="majorEastAsia" w:hAnsiTheme="majorEastAsia" w:eastAsiaTheme="majorEastAsia" w:cstheme="majorEastAsia"/>
+                <w:b w:val="0"/>
+                <w:bCs w:val="0"/>
+                <w:color w:val="auto"/>
+                <w:sz w:val="20"/>
+                <w:szCs w:val="20"/>
+                <w:vertAlign w:val="baseline"/>
+              </w:rPr>
+            </w:pPr>
+            <w:r>
+              <w:rPr>
+                <w:rFonts w:hint="default" w:asciiTheme="majorEastAsia" w:hAnsiTheme="majorEastAsia" w:eastAsiaTheme="majorEastAsia" w:cstheme="majorEastAsia"/>
+                <w:b w:val="0"/>
+                <w:bCs w:val="0"/>
+                <w:color w:val="auto"/>
+                <w:sz w:val="20"/>
+                <w:szCs w:val="20"/>
+                <w:vertAlign w:val="baseline"/>
+              </w:rPr>
+              <w:t>Ouput</w:t>
+            </w:r>
+          </w:p>
+        </w:tc>
+        <w:tc>
+          <w:tcPr>
+            <w:tcW w:w="840" w:type="dxa"/>
+            <w:tcBorders>
+              <w:tl2br w:val="nil"/>
+              <w:tr2bl w:val="nil"/>
+            </w:tcBorders>
+            <w:shd w:val="clear" w:color="auto" w:fill="auto"/>
+            <w:vAlign w:val="top"/>
+          </w:tcPr>
+          <w:p>
+            <w:pPr>
+              <w:widowControl w:val="0"/>
+              <w:jc w:val="left"/>
+              <w:rPr>
+                <w:rFonts w:hint="eastAsia" w:asciiTheme="majorEastAsia" w:hAnsiTheme="majorEastAsia" w:eastAsiaTheme="majorEastAsia" w:cstheme="majorEastAsia"/>
+                <w:b w:val="0"/>
+                <w:bCs w:val="0"/>
+                <w:color w:val="auto"/>
+                <w:sz w:val="20"/>
+                <w:szCs w:val="20"/>
+                <w:vertAlign w:val="baseline"/>
+              </w:rPr>
+            </w:pPr>
+          </w:p>
+        </w:tc>
+        <w:tc>
+          <w:tcPr>
+            <w:tcW w:w="4455" w:type="dxa"/>
+            <w:tcBorders>
+              <w:tl2br w:val="nil"/>
+              <w:tr2bl w:val="nil"/>
+            </w:tcBorders>
+            <w:shd w:val="clear" w:color="auto" w:fill="auto"/>
+            <w:vAlign w:val="top"/>
+          </w:tcPr>
+          <w:p>
+            <w:pPr>
+              <w:widowControl w:val="0"/>
+              <w:jc w:val="left"/>
+              <w:rPr>
+                <w:rFonts w:hint="eastAsia" w:asciiTheme="majorEastAsia" w:hAnsiTheme="majorEastAsia" w:eastAsiaTheme="majorEastAsia" w:cstheme="majorEastAsia"/>
+                <w:b w:val="0"/>
+                <w:bCs w:val="0"/>
+                <w:color w:val="auto"/>
+                <w:sz w:val="20"/>
+                <w:szCs w:val="20"/>
+                <w:vertAlign w:val="baseline"/>
+              </w:rPr>
+            </w:pPr>
+          </w:p>
+        </w:tc>
+      </w:tr>
+    </w:tbl>
+    <w:p>
+      <w:pPr>
+        <w:numPr>
+          <w:ilvl w:val="0"/>
+          <w:numId w:val="0"/>
+        </w:numPr>
+        <w:jc w:val="left"/>
+        <w:outlineLvl w:val="0"/>
+        <w:rPr>
+          <w:rFonts w:hint="eastAsia" w:asciiTheme="majorEastAsia" w:hAnsiTheme="majorEastAsia" w:eastAsiaTheme="majorEastAsia" w:cstheme="majorEastAsia"/>
+          <w:b/>
+          <w:bCs/>
+          <w:i w:val="0"/>
+          <w:iCs w:val="0"/>
+          <w:color w:val="auto"/>
+          <w:sz w:val="20"/>
+          <w:szCs w:val="20"/>
+        </w:rPr>
+      </w:pPr>
+    </w:p>
+    <w:p>
+      <w:pPr>
+        <w:numPr>
+          <w:ilvl w:val="2"/>
+          <w:numId w:val="3"/>
+        </w:numPr>
+        <w:ind w:left="0" w:leftChars="0" w:firstLine="0" w:firstLineChars="0"/>
+        <w:jc w:val="left"/>
+        <w:outlineLvl w:val="0"/>
+        <w:rPr>
+          <w:rFonts w:hint="eastAsia" w:asciiTheme="majorEastAsia" w:hAnsiTheme="majorEastAsia" w:eastAsiaTheme="majorEastAsia" w:cstheme="majorEastAsia"/>
+          <w:b/>
+          <w:bCs/>
+          <w:i w:val="0"/>
+          <w:iCs w:val="0"/>
+          <w:color w:val="auto"/>
+          <w:sz w:val="20"/>
+          <w:szCs w:val="20"/>
+        </w:rPr>
+      </w:pPr>
+      <w:r>
+        <w:rPr>
+          <w:rFonts w:hint="default" w:asciiTheme="majorEastAsia" w:hAnsiTheme="majorEastAsia" w:eastAsiaTheme="majorEastAsia" w:cstheme="majorEastAsia"/>
+          <w:b/>
+          <w:bCs/>
+          <w:i w:val="0"/>
+          <w:iCs w:val="0"/>
+          <w:color w:val="auto"/>
+          <w:sz w:val="20"/>
+          <w:szCs w:val="20"/>
+        </w:rPr>
+        <w:t>Operation</w:t>
+      </w:r>
+    </w:p>
+    <w:p>
+      <w:pPr>
+        <w:numPr>
+          <w:numId w:val="0"/>
+        </w:numPr>
+        <w:jc w:val="left"/>
+        <w:outlineLvl w:val="0"/>
+        <w:rPr>
+          <w:rFonts w:hint="eastAsia" w:asciiTheme="majorEastAsia" w:hAnsiTheme="majorEastAsia" w:eastAsiaTheme="majorEastAsia" w:cstheme="majorEastAsia"/>
+          <w:b/>
+          <w:bCs/>
+          <w:i w:val="0"/>
+          <w:iCs w:val="0"/>
+          <w:color w:val="auto"/>
+          <w:sz w:val="20"/>
+          <w:szCs w:val="20"/>
+        </w:rPr>
+      </w:pPr>
+    </w:p>
+    <w:p>
+      <w:pPr>
+        <w:numPr>
+          <w:ilvl w:val="2"/>
+          <w:numId w:val="3"/>
+        </w:numPr>
+        <w:ind w:left="0" w:leftChars="0" w:firstLine="0" w:firstLineChars="0"/>
+        <w:jc w:val="left"/>
+        <w:outlineLvl w:val="0"/>
+        <w:rPr>
+          <w:rFonts w:hint="eastAsia" w:asciiTheme="majorEastAsia" w:hAnsiTheme="majorEastAsia" w:eastAsiaTheme="majorEastAsia" w:cstheme="majorEastAsia"/>
+          <w:b/>
+          <w:bCs/>
+          <w:i w:val="0"/>
+          <w:iCs w:val="0"/>
+          <w:color w:val="auto"/>
+          <w:sz w:val="20"/>
+          <w:szCs w:val="20"/>
+        </w:rPr>
+      </w:pPr>
+      <w:r>
+        <w:rPr>
+          <w:rFonts w:hint="default" w:asciiTheme="majorEastAsia" w:hAnsiTheme="majorEastAsia" w:eastAsiaTheme="majorEastAsia" w:cstheme="majorEastAsia"/>
+          <w:b/>
+          <w:bCs/>
+          <w:i w:val="0"/>
+          <w:iCs w:val="0"/>
+          <w:color w:val="auto"/>
+          <w:sz w:val="20"/>
+          <w:szCs w:val="20"/>
+        </w:rPr>
+        <w:t>Implementation</w:t>
+      </w:r>
+    </w:p>
+    <w:p>
+      <w:pPr>
+        <w:numPr>
+          <w:numId w:val="0"/>
+        </w:numPr>
+        <w:jc w:val="left"/>
+        <w:outlineLvl w:val="0"/>
+        <w:rPr>
+          <w:rFonts w:hint="eastAsia" w:asciiTheme="majorEastAsia" w:hAnsiTheme="majorEastAsia" w:eastAsiaTheme="majorEastAsia" w:cstheme="majorEastAsia"/>
+          <w:b/>
+          <w:bCs/>
+          <w:i w:val="0"/>
+          <w:iCs w:val="0"/>
+          <w:color w:val="auto"/>
+          <w:sz w:val="20"/>
+          <w:szCs w:val="20"/>
+        </w:rPr>
+      </w:pPr>
+    </w:p>
+    <w:p>
+      <w:pPr>
+        <w:numPr>
+          <w:ilvl w:val="1"/>
+          <w:numId w:val="3"/>
+        </w:numPr>
+        <w:ind w:left="0" w:leftChars="0" w:firstLine="0" w:firstLineChars="0"/>
+        <w:jc w:val="left"/>
+        <w:outlineLvl w:val="0"/>
+        <w:rPr>
+          <w:rFonts w:hint="eastAsia" w:asciiTheme="majorEastAsia" w:hAnsiTheme="majorEastAsia" w:eastAsiaTheme="majorEastAsia" w:cstheme="majorEastAsia"/>
+          <w:b/>
+          <w:bCs/>
+          <w:i w:val="0"/>
+          <w:iCs w:val="0"/>
+          <w:color w:val="auto"/>
+          <w:sz w:val="20"/>
+          <w:szCs w:val="20"/>
+        </w:rPr>
+      </w:pPr>
+      <w:r>
+        <w:rPr>
+          <w:rFonts w:hint="default" w:asciiTheme="majorEastAsia" w:hAnsiTheme="majorEastAsia" w:eastAsiaTheme="majorEastAsia" w:cstheme="majorEastAsia"/>
+          <w:b/>
+          <w:bCs/>
+          <w:i w:val="0"/>
+          <w:iCs w:val="0"/>
+          <w:color w:val="auto"/>
+          <w:sz w:val="20"/>
+          <w:szCs w:val="20"/>
+        </w:rPr>
+        <w:t>AHB Master</w:t>
+      </w:r>
+    </w:p>
+    <w:p>
+      <w:pPr>
+        <w:numPr>
+          <w:ilvl w:val="1"/>
+          <w:numId w:val="3"/>
+        </w:numPr>
+        <w:ind w:left="0" w:leftChars="0" w:firstLine="0" w:firstLineChars="0"/>
+        <w:jc w:val="left"/>
+        <w:outlineLvl w:val="0"/>
+        <w:rPr>
+          <w:rFonts w:hint="eastAsia" w:asciiTheme="majorEastAsia" w:hAnsiTheme="majorEastAsia" w:eastAsiaTheme="majorEastAsia" w:cstheme="majorEastAsia"/>
+          <w:b/>
+          <w:bCs/>
+          <w:i w:val="0"/>
+          <w:iCs w:val="0"/>
+          <w:color w:val="auto"/>
+          <w:sz w:val="20"/>
+          <w:szCs w:val="20"/>
+        </w:rPr>
+      </w:pPr>
+      <w:r>
+        <w:rPr>
+          <w:rFonts w:hint="default" w:asciiTheme="majorEastAsia" w:hAnsiTheme="majorEastAsia" w:eastAsiaTheme="majorEastAsia" w:cstheme="majorEastAsia"/>
+          <w:b/>
+          <w:bCs/>
+          <w:i w:val="0"/>
+          <w:iCs w:val="0"/>
+          <w:color w:val="auto"/>
+          <w:sz w:val="20"/>
+          <w:szCs w:val="20"/>
+        </w:rPr>
+        <w:t>AHB Slave</w:t>
+      </w:r>
     </w:p>
     <w:p>
       <w:pPr>
@@ -4482,7 +6329,73 @@
           <w:sz w:val="20"/>
           <w:szCs w:val="20"/>
         </w:rPr>
-        <w:t>Addressmap</w:t>
+        <w:t>APB Sub-system UART</w:t>
+      </w:r>
+    </w:p>
+    <w:p>
+      <w:pPr>
+        <w:numPr>
+          <w:ilvl w:val="0"/>
+          <w:numId w:val="3"/>
+        </w:numPr>
+        <w:jc w:val="left"/>
+        <w:outlineLvl w:val="0"/>
+        <w:rPr>
+          <w:rFonts w:hint="eastAsia" w:asciiTheme="majorEastAsia" w:hAnsiTheme="majorEastAsia" w:eastAsiaTheme="majorEastAsia" w:cstheme="majorEastAsia"/>
+          <w:b/>
+          <w:bCs/>
+          <w:i w:val="0"/>
+          <w:iCs w:val="0"/>
+          <w:color w:val="auto"/>
+          <w:sz w:val="20"/>
+          <w:szCs w:val="20"/>
+        </w:rPr>
+      </w:pPr>
+      <w:r>
+        <w:rPr>
+          <w:rFonts w:hint="default" w:asciiTheme="majorEastAsia" w:hAnsiTheme="majorEastAsia" w:eastAsiaTheme="majorEastAsia" w:cstheme="majorEastAsia"/>
+          <w:b/>
+          <w:bCs/>
+          <w:i w:val="0"/>
+          <w:iCs w:val="0"/>
+          <w:color w:val="auto"/>
+          <w:sz w:val="20"/>
+          <w:szCs w:val="20"/>
+        </w:rPr>
+        <w:t>APB Sub-system I2C</w:t>
+      </w:r>
+    </w:p>
+    <w:p>
+      <w:pPr>
+        <w:numPr>
+          <w:ilvl w:val="0"/>
+          <w:numId w:val="3"/>
+        </w:numPr>
+        <w:jc w:val="left"/>
+        <w:outlineLvl w:val="0"/>
+        <w:rPr>
+          <w:rFonts w:hint="eastAsia" w:asciiTheme="majorEastAsia" w:hAnsiTheme="majorEastAsia" w:eastAsiaTheme="majorEastAsia" w:cstheme="majorEastAsia"/>
+          <w:b/>
+          <w:bCs/>
+          <w:i w:val="0"/>
+          <w:iCs w:val="0"/>
+          <w:color w:val="auto"/>
+          <w:sz w:val="20"/>
+          <w:szCs w:val="20"/>
+        </w:rPr>
+      </w:pPr>
+      <w:r>
+        <w:rPr>
+          <w:rFonts w:hint="default" w:asciiTheme="majorEastAsia" w:hAnsiTheme="majorEastAsia" w:eastAsiaTheme="majorEastAsia" w:cstheme="majorEastAsia"/>
+          <w:b/>
+          <w:bCs/>
+          <w:i w:val="0"/>
+          <w:iCs w:val="0"/>
+          <w:color w:val="auto"/>
+          <w:sz w:val="20"/>
+          <w:szCs w:val="20"/>
+        </w:rPr>
+        <w:t>APB Sub-system SPI</w:t>
       </w:r>
     </w:p>
     <w:sectPr>

</xml_diff>